<commit_message>
Se Cargo Logo e Inicio
</commit_message>
<xml_diff>
--- a/docs/Documentacion Saas.docx
+++ b/docs/Documentacion Saas.docx
@@ -317,7 +317,7 @@
           <w:lang w:eastAsia="es-MX"/>
         </w:rPr>
         <w:pict>
-          <v:rect id="_x0000_i1031" alt="" style="width:441.9pt;height:.05pt;mso-width-percent:0;mso-height-percent:0;mso-width-percent:0;mso-height-percent:0" o:hralign="center" o:hrstd="t" o:hr="t" fillcolor="#a0a0a0" stroked="f"/>
+          <v:rect id="_x0000_i1059" alt="" style="width:441.9pt;height:.05pt;mso-width-percent:0;mso-height-percent:0;mso-width-percent:0;mso-height-percent:0" o:hralign="center" o:hrstd="t" o:hr="t" fillcolor="#a0a0a0" stroked="f"/>
         </w:pict>
       </w:r>
     </w:p>
@@ -407,7 +407,7 @@
           <w:lang w:eastAsia="es-MX"/>
         </w:rPr>
         <w:pict>
-          <v:rect id="_x0000_i1030" alt="" style="width:441.9pt;height:.05pt;mso-width-percent:0;mso-height-percent:0;mso-width-percent:0;mso-height-percent:0" o:hralign="center" o:hrstd="t" o:hr="t" fillcolor="#a0a0a0" stroked="f"/>
+          <v:rect id="_x0000_i1058" alt="" style="width:441.9pt;height:.05pt;mso-width-percent:0;mso-height-percent:0;mso-width-percent:0;mso-height-percent:0" o:hralign="center" o:hrstd="t" o:hr="t" fillcolor="#a0a0a0" stroked="f"/>
         </w:pict>
       </w:r>
     </w:p>
@@ -477,7 +477,7 @@
           <w:lang w:eastAsia="es-MX"/>
         </w:rPr>
         <w:pict>
-          <v:rect id="_x0000_i1029" alt="" style="width:441.9pt;height:.05pt;mso-width-percent:0;mso-height-percent:0;mso-width-percent:0;mso-height-percent:0" o:hralign="center" o:hrstd="t" o:hr="t" fillcolor="#a0a0a0" stroked="f"/>
+          <v:rect id="_x0000_i1057" alt="" style="width:441.9pt;height:.05pt;mso-width-percent:0;mso-height-percent:0;mso-width-percent:0;mso-height-percent:0" o:hralign="center" o:hrstd="t" o:hr="t" fillcolor="#a0a0a0" stroked="f"/>
         </w:pict>
       </w:r>
     </w:p>
@@ -696,7 +696,7 @@
           <w:lang w:eastAsia="es-MX"/>
         </w:rPr>
         <w:pict>
-          <v:rect id="_x0000_i1028" alt="" style="width:441.9pt;height:.05pt;mso-width-percent:0;mso-height-percent:0;mso-width-percent:0;mso-height-percent:0" o:hralign="center" o:hrstd="t" o:hr="t" fillcolor="#a0a0a0" stroked="f"/>
+          <v:rect id="_x0000_i1056" alt="" style="width:441.9pt;height:.05pt;mso-width-percent:0;mso-height-percent:0;mso-width-percent:0;mso-height-percent:0" o:hralign="center" o:hrstd="t" o:hr="t" fillcolor="#a0a0a0" stroked="f"/>
         </w:pict>
       </w:r>
     </w:p>
@@ -1833,7 +1833,7 @@
           <w:lang w:eastAsia="es-MX"/>
         </w:rPr>
         <w:pict>
-          <v:rect id="_x0000_i1027" alt="" style="width:441.9pt;height:.05pt;mso-width-percent:0;mso-height-percent:0;mso-width-percent:0;mso-height-percent:0" o:hralign="center" o:hrstd="t" o:hr="t" fillcolor="#a0a0a0" stroked="f"/>
+          <v:rect id="_x0000_i1055" alt="" style="width:441.9pt;height:.05pt;mso-width-percent:0;mso-height-percent:0;mso-width-percent:0;mso-height-percent:0" o:hralign="center" o:hrstd="t" o:hr="t" fillcolor="#a0a0a0" stroked="f"/>
         </w:pict>
       </w:r>
     </w:p>
@@ -2315,7 +2315,7 @@
           <w:lang w:eastAsia="es-MX"/>
         </w:rPr>
         <w:pict>
-          <v:rect id="_x0000_i1026" alt="" style="width:441.9pt;height:.05pt;mso-width-percent:0;mso-height-percent:0;mso-width-percent:0;mso-height-percent:0" o:hralign="center" o:hrstd="t" o:hr="t" fillcolor="#a0a0a0" stroked="f"/>
+          <v:rect id="_x0000_i1054" alt="" style="width:441.9pt;height:.05pt;mso-width-percent:0;mso-height-percent:0;mso-width-percent:0;mso-height-percent:0" o:hralign="center" o:hrstd="t" o:hr="t" fillcolor="#a0a0a0" stroked="f"/>
         </w:pict>
       </w:r>
     </w:p>
@@ -2557,7 +2557,7 @@
           <w:lang w:eastAsia="es-MX"/>
         </w:rPr>
         <w:pict>
-          <v:rect id="_x0000_i1025" alt="" style="width:441.9pt;height:.05pt;mso-width-percent:0;mso-height-percent:0;mso-width-percent:0;mso-height-percent:0" o:hralign="center" o:hrstd="t" o:hr="t" fillcolor="#a0a0a0" stroked="f"/>
+          <v:rect id="_x0000_i1053" alt="" style="width:441.9pt;height:.05pt;mso-width-percent:0;mso-height-percent:0;mso-width-percent:0;mso-height-percent:0" o:hralign="center" o:hrstd="t" o:hr="t" fillcolor="#a0a0a0" stroked="f"/>
         </w:pict>
       </w:r>
     </w:p>
@@ -2934,6 +2934,2646 @@
           <w:rStyle w:val="CdigoHTML"/>
         </w:rPr>
         <w:t>└── .gitignore</w:t>
+      </w:r>
+    </w:p>
+    <w:p>
+      <w:pPr>
+        <w:spacing w:before="100" w:beforeAutospacing="1" w:after="100" w:afterAutospacing="1"/>
+        <w:rPr>
+          <w:rFonts w:ascii="Times New Roman" w:eastAsia="Times New Roman" w:hAnsi="Times New Roman" w:cs="Times New Roman"/>
+          <w:kern w:val="0"/>
+          <w:lang w:eastAsia="es-MX"/>
+          <w14:ligatures w14:val="none"/>
+        </w:rPr>
+      </w:pPr>
+    </w:p>
+    <w:p>
+      <w:pPr>
+        <w:spacing w:before="100" w:beforeAutospacing="1" w:after="100" w:afterAutospacing="1"/>
+        <w:rPr>
+          <w:rFonts w:ascii="Times New Roman" w:eastAsia="Times New Roman" w:hAnsi="Times New Roman" w:cs="Times New Roman"/>
+          <w:kern w:val="0"/>
+          <w:lang w:eastAsia="es-MX"/>
+          <w14:ligatures w14:val="none"/>
+        </w:rPr>
+      </w:pPr>
+    </w:p>
+    <w:p>
+      <w:pPr>
+        <w:spacing w:before="100" w:beforeAutospacing="1" w:after="100" w:afterAutospacing="1"/>
+        <w:rPr>
+          <w:rFonts w:ascii="Times New Roman" w:eastAsia="Times New Roman" w:hAnsi="Times New Roman" w:cs="Times New Roman"/>
+          <w:kern w:val="0"/>
+          <w:lang w:eastAsia="es-MX"/>
+          <w14:ligatures w14:val="none"/>
+        </w:rPr>
+      </w:pPr>
+    </w:p>
+    <w:p>
+      <w:pPr>
+        <w:pStyle w:val="NormalWeb"/>
+      </w:pPr>
+      <w:r>
+        <w:t xml:space="preserve">El logo transmite una imagen moderna, tecnológica y profesional. Los colores principales son </w:t>
+      </w:r>
+      <w:r>
+        <w:rPr>
+          <w:rStyle w:val="Textoennegrita"/>
+        </w:rPr>
+        <w:t>azul marino</w:t>
+      </w:r>
+      <w:r>
+        <w:t xml:space="preserve">, </w:t>
+      </w:r>
+      <w:r>
+        <w:rPr>
+          <w:rStyle w:val="Textoennegrita"/>
+        </w:rPr>
+        <w:t>naranja</w:t>
+      </w:r>
+      <w:r>
+        <w:t xml:space="preserve">, </w:t>
+      </w:r>
+      <w:r>
+        <w:rPr>
+          <w:rStyle w:val="Textoennegrita"/>
+        </w:rPr>
+        <w:t>blanco</w:t>
+      </w:r>
+      <w:r>
+        <w:t xml:space="preserve"> y </w:t>
+      </w:r>
+      <w:r>
+        <w:rPr>
+          <w:rStyle w:val="Textoennegrita"/>
+        </w:rPr>
+        <w:t>grises suaves</w:t>
+      </w:r>
+      <w:r>
+        <w:t>, una combinación muy adecuada para un SaaS.</w:t>
+      </w:r>
+    </w:p>
+    <w:p>
+      <w:pPr>
+        <w:pStyle w:val="Ttulo2"/>
+      </w:pPr>
+      <w:r>
+        <w:rPr>
+          <w:rFonts w:ascii="Apple Color Emoji" w:hAnsi="Apple Color Emoji" w:cs="Apple Color Emoji"/>
+        </w:rPr>
+        <w:t>🎨</w:t>
+      </w:r>
+      <w:r>
+        <w:t xml:space="preserve"> Paleta principal (Brand Colors)</w:t>
+      </w:r>
+    </w:p>
+    <w:tbl>
+      <w:tblPr>
+        <w:tblW w:w="0" w:type="auto"/>
+        <w:tblCellSpacing w:w="15" w:type="dxa"/>
+        <w:tblCellMar>
+          <w:top w:w="15" w:type="dxa"/>
+          <w:left w:w="15" w:type="dxa"/>
+          <w:bottom w:w="15" w:type="dxa"/>
+          <w:right w:w="15" w:type="dxa"/>
+        </w:tblCellMar>
+        <w:tblLook w:val="04A0" w:firstRow="1" w:lastRow="0" w:firstColumn="1" w:lastColumn="0" w:noHBand="0" w:noVBand="1"/>
+      </w:tblPr>
+      <w:tblGrid>
+        <w:gridCol w:w="2030"/>
+        <w:gridCol w:w="590"/>
+        <w:gridCol w:w="938"/>
+      </w:tblGrid>
+      <w:tr>
+        <w:trPr>
+          <w:tblHeader/>
+          <w:tblCellSpacing w:w="15" w:type="dxa"/>
+        </w:trPr>
+        <w:tc>
+          <w:tcPr>
+            <w:tcW w:w="0" w:type="auto"/>
+            <w:vAlign w:val="center"/>
+            <w:hideMark/>
+          </w:tcPr>
+          <w:p>
+            <w:pPr>
+              <w:jc w:val="center"/>
+              <w:rPr>
+                <w:b/>
+                <w:bCs/>
+              </w:rPr>
+            </w:pPr>
+            <w:r>
+              <w:rPr>
+                <w:b/>
+                <w:bCs/>
+              </w:rPr>
+              <w:t>Uso</w:t>
+            </w:r>
+          </w:p>
+        </w:tc>
+        <w:tc>
+          <w:tcPr>
+            <w:tcW w:w="0" w:type="auto"/>
+            <w:vAlign w:val="center"/>
+            <w:hideMark/>
+          </w:tcPr>
+          <w:p>
+            <w:pPr>
+              <w:jc w:val="center"/>
+              <w:rPr>
+                <w:b/>
+                <w:bCs/>
+              </w:rPr>
+            </w:pPr>
+            <w:r>
+              <w:rPr>
+                <w:b/>
+                <w:bCs/>
+              </w:rPr>
+              <w:t>Color</w:t>
+            </w:r>
+          </w:p>
+        </w:tc>
+        <w:tc>
+          <w:tcPr>
+            <w:tcW w:w="0" w:type="auto"/>
+            <w:vAlign w:val="center"/>
+            <w:hideMark/>
+          </w:tcPr>
+          <w:p>
+            <w:pPr>
+              <w:jc w:val="center"/>
+              <w:rPr>
+                <w:b/>
+                <w:bCs/>
+              </w:rPr>
+            </w:pPr>
+            <w:r>
+              <w:rPr>
+                <w:b/>
+                <w:bCs/>
+              </w:rPr>
+              <w:t>Hex</w:t>
+            </w:r>
+          </w:p>
+        </w:tc>
+      </w:tr>
+      <w:tr>
+        <w:trPr>
+          <w:tblCellSpacing w:w="15" w:type="dxa"/>
+        </w:trPr>
+        <w:tc>
+          <w:tcPr>
+            <w:tcW w:w="0" w:type="auto"/>
+            <w:vAlign w:val="center"/>
+            <w:hideMark/>
+          </w:tcPr>
+          <w:p>
+            <w:r>
+              <w:rPr>
+                <w:rFonts w:ascii="Apple Color Emoji" w:hAnsi="Apple Color Emoji" w:cs="Apple Color Emoji"/>
+              </w:rPr>
+              <w:t>🔵</w:t>
+            </w:r>
+            <w:r>
+              <w:t xml:space="preserve"> Azul principal</w:t>
+            </w:r>
+          </w:p>
+        </w:tc>
+        <w:tc>
+          <w:tcPr>
+            <w:tcW w:w="0" w:type="auto"/>
+            <w:vAlign w:val="center"/>
+            <w:hideMark/>
+          </w:tcPr>
+          <w:p/>
+        </w:tc>
+        <w:tc>
+          <w:tcPr>
+            <w:tcW w:w="0" w:type="auto"/>
+            <w:vAlign w:val="center"/>
+            <w:hideMark/>
+          </w:tcPr>
+          <w:p>
+            <w:r>
+              <w:rPr>
+                <w:rStyle w:val="Textoennegrita"/>
+              </w:rPr>
+              <w:t>#0B2348</w:t>
+            </w:r>
+          </w:p>
+        </w:tc>
+      </w:tr>
+      <w:tr>
+        <w:trPr>
+          <w:tblCellSpacing w:w="15" w:type="dxa"/>
+        </w:trPr>
+        <w:tc>
+          <w:tcPr>
+            <w:tcW w:w="0" w:type="auto"/>
+            <w:vAlign w:val="center"/>
+            <w:hideMark/>
+          </w:tcPr>
+          <w:p>
+            <w:r>
+              <w:rPr>
+                <w:rFonts w:ascii="Apple Color Emoji" w:hAnsi="Apple Color Emoji" w:cs="Apple Color Emoji"/>
+              </w:rPr>
+              <w:t>🟠</w:t>
+            </w:r>
+            <w:r>
+              <w:t xml:space="preserve"> Naranja principal</w:t>
+            </w:r>
+          </w:p>
+        </w:tc>
+        <w:tc>
+          <w:tcPr>
+            <w:tcW w:w="0" w:type="auto"/>
+            <w:vAlign w:val="center"/>
+            <w:hideMark/>
+          </w:tcPr>
+          <w:p/>
+        </w:tc>
+        <w:tc>
+          <w:tcPr>
+            <w:tcW w:w="0" w:type="auto"/>
+            <w:vAlign w:val="center"/>
+            <w:hideMark/>
+          </w:tcPr>
+          <w:p>
+            <w:r>
+              <w:rPr>
+                <w:rStyle w:val="Textoennegrita"/>
+              </w:rPr>
+              <w:t>#FF7A00</w:t>
+            </w:r>
+          </w:p>
+        </w:tc>
+      </w:tr>
+      <w:tr>
+        <w:trPr>
+          <w:tblCellSpacing w:w="15" w:type="dxa"/>
+        </w:trPr>
+        <w:tc>
+          <w:tcPr>
+            <w:tcW w:w="0" w:type="auto"/>
+            <w:vAlign w:val="center"/>
+            <w:hideMark/>
+          </w:tcPr>
+          <w:p>
+            <w:r>
+              <w:rPr>
+                <w:rFonts w:ascii="Apple Color Emoji" w:hAnsi="Apple Color Emoji" w:cs="Apple Color Emoji"/>
+              </w:rPr>
+              <w:t>⚪</w:t>
+            </w:r>
+            <w:r>
+              <w:t xml:space="preserve"> Blanco</w:t>
+            </w:r>
+          </w:p>
+        </w:tc>
+        <w:tc>
+          <w:tcPr>
+            <w:tcW w:w="0" w:type="auto"/>
+            <w:vAlign w:val="center"/>
+            <w:hideMark/>
+          </w:tcPr>
+          <w:p/>
+        </w:tc>
+        <w:tc>
+          <w:tcPr>
+            <w:tcW w:w="0" w:type="auto"/>
+            <w:vAlign w:val="center"/>
+            <w:hideMark/>
+          </w:tcPr>
+          <w:p>
+            <w:r>
+              <w:rPr>
+                <w:rStyle w:val="Textoennegrita"/>
+              </w:rPr>
+              <w:t>#FFFFFF</w:t>
+            </w:r>
+          </w:p>
+        </w:tc>
+      </w:tr>
+      <w:tr>
+        <w:trPr>
+          <w:tblCellSpacing w:w="15" w:type="dxa"/>
+        </w:trPr>
+        <w:tc>
+          <w:tcPr>
+            <w:tcW w:w="0" w:type="auto"/>
+            <w:vAlign w:val="center"/>
+            <w:hideMark/>
+          </w:tcPr>
+          <w:p>
+            <w:r>
+              <w:rPr>
+                <w:rFonts w:ascii="Apple Color Emoji" w:hAnsi="Apple Color Emoji" w:cs="Apple Color Emoji"/>
+              </w:rPr>
+              <w:t>⚫</w:t>
+            </w:r>
+            <w:r>
+              <w:t xml:space="preserve"> Gris oscuro</w:t>
+            </w:r>
+          </w:p>
+        </w:tc>
+        <w:tc>
+          <w:tcPr>
+            <w:tcW w:w="0" w:type="auto"/>
+            <w:vAlign w:val="center"/>
+            <w:hideMark/>
+          </w:tcPr>
+          <w:p/>
+        </w:tc>
+        <w:tc>
+          <w:tcPr>
+            <w:tcW w:w="0" w:type="auto"/>
+            <w:vAlign w:val="center"/>
+            <w:hideMark/>
+          </w:tcPr>
+          <w:p>
+            <w:r>
+              <w:rPr>
+                <w:rStyle w:val="Textoennegrita"/>
+              </w:rPr>
+              <w:t>#374151</w:t>
+            </w:r>
+          </w:p>
+        </w:tc>
+      </w:tr>
+      <w:tr>
+        <w:trPr>
+          <w:tblCellSpacing w:w="15" w:type="dxa"/>
+        </w:trPr>
+        <w:tc>
+          <w:tcPr>
+            <w:tcW w:w="0" w:type="auto"/>
+            <w:vAlign w:val="center"/>
+            <w:hideMark/>
+          </w:tcPr>
+          <w:p>
+            <w:r>
+              <w:rPr>
+                <w:rFonts w:ascii="Apple Color Emoji" w:hAnsi="Apple Color Emoji" w:cs="Apple Color Emoji"/>
+              </w:rPr>
+              <w:t>⚪</w:t>
+            </w:r>
+            <w:r>
+              <w:t xml:space="preserve"> Gris claro</w:t>
+            </w:r>
+          </w:p>
+        </w:tc>
+        <w:tc>
+          <w:tcPr>
+            <w:tcW w:w="0" w:type="auto"/>
+            <w:vAlign w:val="center"/>
+            <w:hideMark/>
+          </w:tcPr>
+          <w:p/>
+        </w:tc>
+        <w:tc>
+          <w:tcPr>
+            <w:tcW w:w="0" w:type="auto"/>
+            <w:vAlign w:val="center"/>
+            <w:hideMark/>
+          </w:tcPr>
+          <w:p>
+            <w:r>
+              <w:rPr>
+                <w:rStyle w:val="Textoennegrita"/>
+              </w:rPr>
+              <w:t>#F5F7FA</w:t>
+            </w:r>
+          </w:p>
+        </w:tc>
+      </w:tr>
+    </w:tbl>
+    <w:p>
+      <w:r>
+        <w:rPr>
+          <w:noProof/>
+        </w:rPr>
+        <w:pict>
+          <v:rect id="_x0000_i1052" alt="" style="width:441.9pt;height:.05pt;mso-width-percent:0;mso-height-percent:0;mso-width-percent:0;mso-height-percent:0" o:hralign="center" o:hrstd="t" o:hr="t" fillcolor="#a0a0a0" stroked="f"/>
+        </w:pict>
+      </w:r>
+    </w:p>
+    <w:p>
+      <w:pPr>
+        <w:pStyle w:val="Ttulo1"/>
+      </w:pPr>
+      <w:r>
+        <w:rPr>
+          <w:rFonts w:ascii="Apple Color Emoji" w:hAnsi="Apple Color Emoji" w:cs="Apple Color Emoji"/>
+        </w:rPr>
+        <w:lastRenderedPageBreak/>
+        <w:t>🎨</w:t>
+      </w:r>
+      <w:r>
+        <w:t xml:space="preserve"> Colores secundarios</w:t>
+      </w:r>
+    </w:p>
+    <w:tbl>
+      <w:tblPr>
+        <w:tblW w:w="0" w:type="auto"/>
+        <w:tblCellSpacing w:w="15" w:type="dxa"/>
+        <w:tblCellMar>
+          <w:top w:w="15" w:type="dxa"/>
+          <w:left w:w="15" w:type="dxa"/>
+          <w:bottom w:w="15" w:type="dxa"/>
+          <w:right w:w="15" w:type="dxa"/>
+        </w:tblCellMar>
+        <w:tblLook w:val="04A0" w:firstRow="1" w:lastRow="0" w:firstColumn="1" w:lastColumn="0" w:noHBand="0" w:noVBand="1"/>
+      </w:tblPr>
+      <w:tblGrid>
+        <w:gridCol w:w="1472"/>
+        <w:gridCol w:w="966"/>
+      </w:tblGrid>
+      <w:tr>
+        <w:trPr>
+          <w:tblHeader/>
+          <w:tblCellSpacing w:w="15" w:type="dxa"/>
+        </w:trPr>
+        <w:tc>
+          <w:tcPr>
+            <w:tcW w:w="0" w:type="auto"/>
+            <w:vAlign w:val="center"/>
+            <w:hideMark/>
+          </w:tcPr>
+          <w:p>
+            <w:pPr>
+              <w:jc w:val="center"/>
+              <w:rPr>
+                <w:b/>
+                <w:bCs/>
+              </w:rPr>
+            </w:pPr>
+            <w:r>
+              <w:rPr>
+                <w:b/>
+                <w:bCs/>
+              </w:rPr>
+              <w:t>Uso</w:t>
+            </w:r>
+          </w:p>
+        </w:tc>
+        <w:tc>
+          <w:tcPr>
+            <w:tcW w:w="0" w:type="auto"/>
+            <w:vAlign w:val="center"/>
+            <w:hideMark/>
+          </w:tcPr>
+          <w:p>
+            <w:pPr>
+              <w:jc w:val="center"/>
+              <w:rPr>
+                <w:b/>
+                <w:bCs/>
+              </w:rPr>
+            </w:pPr>
+            <w:r>
+              <w:rPr>
+                <w:b/>
+                <w:bCs/>
+              </w:rPr>
+              <w:t>Hex</w:t>
+            </w:r>
+          </w:p>
+        </w:tc>
+      </w:tr>
+      <w:tr>
+        <w:trPr>
+          <w:tblCellSpacing w:w="15" w:type="dxa"/>
+        </w:trPr>
+        <w:tc>
+          <w:tcPr>
+            <w:tcW w:w="0" w:type="auto"/>
+            <w:vAlign w:val="center"/>
+            <w:hideMark/>
+          </w:tcPr>
+          <w:p>
+            <w:r>
+              <w:t>Azul oscuro</w:t>
+            </w:r>
+          </w:p>
+        </w:tc>
+        <w:tc>
+          <w:tcPr>
+            <w:tcW w:w="0" w:type="auto"/>
+            <w:vAlign w:val="center"/>
+            <w:hideMark/>
+          </w:tcPr>
+          <w:p>
+            <w:r>
+              <w:rPr>
+                <w:rStyle w:val="Textoennegrita"/>
+              </w:rPr>
+              <w:t>#061B3A</w:t>
+            </w:r>
+          </w:p>
+        </w:tc>
+      </w:tr>
+      <w:tr>
+        <w:trPr>
+          <w:tblCellSpacing w:w="15" w:type="dxa"/>
+        </w:trPr>
+        <w:tc>
+          <w:tcPr>
+            <w:tcW w:w="0" w:type="auto"/>
+            <w:vAlign w:val="center"/>
+            <w:hideMark/>
+          </w:tcPr>
+          <w:p>
+            <w:r>
+              <w:t>Azul medio</w:t>
+            </w:r>
+          </w:p>
+        </w:tc>
+        <w:tc>
+          <w:tcPr>
+            <w:tcW w:w="0" w:type="auto"/>
+            <w:vAlign w:val="center"/>
+            <w:hideMark/>
+          </w:tcPr>
+          <w:p>
+            <w:r>
+              <w:rPr>
+                <w:rStyle w:val="Textoennegrita"/>
+              </w:rPr>
+              <w:t>#12386B</w:t>
+            </w:r>
+          </w:p>
+        </w:tc>
+      </w:tr>
+      <w:tr>
+        <w:trPr>
+          <w:tblCellSpacing w:w="15" w:type="dxa"/>
+        </w:trPr>
+        <w:tc>
+          <w:tcPr>
+            <w:tcW w:w="0" w:type="auto"/>
+            <w:vAlign w:val="center"/>
+            <w:hideMark/>
+          </w:tcPr>
+          <w:p>
+            <w:r>
+              <w:t>Naranja claro</w:t>
+            </w:r>
+          </w:p>
+        </w:tc>
+        <w:tc>
+          <w:tcPr>
+            <w:tcW w:w="0" w:type="auto"/>
+            <w:vAlign w:val="center"/>
+            <w:hideMark/>
+          </w:tcPr>
+          <w:p>
+            <w:r>
+              <w:rPr>
+                <w:rStyle w:val="Textoennegrita"/>
+              </w:rPr>
+              <w:t>#FF9B2F</w:t>
+            </w:r>
+          </w:p>
+        </w:tc>
+      </w:tr>
+      <w:tr>
+        <w:trPr>
+          <w:tblCellSpacing w:w="15" w:type="dxa"/>
+        </w:trPr>
+        <w:tc>
+          <w:tcPr>
+            <w:tcW w:w="0" w:type="auto"/>
+            <w:vAlign w:val="center"/>
+            <w:hideMark/>
+          </w:tcPr>
+          <w:p>
+            <w:r>
+              <w:t>Gris medio</w:t>
+            </w:r>
+          </w:p>
+        </w:tc>
+        <w:tc>
+          <w:tcPr>
+            <w:tcW w:w="0" w:type="auto"/>
+            <w:vAlign w:val="center"/>
+            <w:hideMark/>
+          </w:tcPr>
+          <w:p>
+            <w:r>
+              <w:rPr>
+                <w:rStyle w:val="Textoennegrita"/>
+              </w:rPr>
+              <w:t>#9CA3AF</w:t>
+            </w:r>
+          </w:p>
+        </w:tc>
+      </w:tr>
+      <w:tr>
+        <w:trPr>
+          <w:tblCellSpacing w:w="15" w:type="dxa"/>
+        </w:trPr>
+        <w:tc>
+          <w:tcPr>
+            <w:tcW w:w="0" w:type="auto"/>
+            <w:vAlign w:val="center"/>
+            <w:hideMark/>
+          </w:tcPr>
+          <w:p>
+            <w:r>
+              <w:t>Gris muy claro</w:t>
+            </w:r>
+          </w:p>
+        </w:tc>
+        <w:tc>
+          <w:tcPr>
+            <w:tcW w:w="0" w:type="auto"/>
+            <w:vAlign w:val="center"/>
+            <w:hideMark/>
+          </w:tcPr>
+          <w:p>
+            <w:r>
+              <w:rPr>
+                <w:rStyle w:val="Textoennegrita"/>
+              </w:rPr>
+              <w:t>#EEF2F7</w:t>
+            </w:r>
+          </w:p>
+        </w:tc>
+      </w:tr>
+    </w:tbl>
+    <w:p>
+      <w:r>
+        <w:pict>
+          <v:rect id="_x0000_i1044" style="width:0;height:1.5pt" o:hralign="center" o:hrstd="t" o:hr="t" fillcolor="#a0a0a0" stroked="f"/>
+        </w:pict>
+      </w:r>
+    </w:p>
+    <w:p>
+      <w:pPr>
+        <w:pStyle w:val="Ttulo1"/>
+      </w:pPr>
+      <w:r>
+        <w:t>Estados del sistema</w:t>
+      </w:r>
+    </w:p>
+    <w:tbl>
+      <w:tblPr>
+        <w:tblW w:w="0" w:type="auto"/>
+        <w:tblCellSpacing w:w="15" w:type="dxa"/>
+        <w:tblCellMar>
+          <w:top w:w="15" w:type="dxa"/>
+          <w:left w:w="15" w:type="dxa"/>
+          <w:bottom w:w="15" w:type="dxa"/>
+          <w:right w:w="15" w:type="dxa"/>
+        </w:tblCellMar>
+        <w:tblLook w:val="04A0" w:firstRow="1" w:lastRow="0" w:firstColumn="1" w:lastColumn="0" w:noHBand="0" w:noVBand="1"/>
+      </w:tblPr>
+      <w:tblGrid>
+        <w:gridCol w:w="1255"/>
+        <w:gridCol w:w="926"/>
+      </w:tblGrid>
+      <w:tr>
+        <w:trPr>
+          <w:tblHeader/>
+          <w:tblCellSpacing w:w="15" w:type="dxa"/>
+        </w:trPr>
+        <w:tc>
+          <w:tcPr>
+            <w:tcW w:w="0" w:type="auto"/>
+            <w:vAlign w:val="center"/>
+            <w:hideMark/>
+          </w:tcPr>
+          <w:p>
+            <w:pPr>
+              <w:jc w:val="center"/>
+              <w:rPr>
+                <w:b/>
+                <w:bCs/>
+              </w:rPr>
+            </w:pPr>
+            <w:r>
+              <w:rPr>
+                <w:b/>
+                <w:bCs/>
+              </w:rPr>
+              <w:t>Estado</w:t>
+            </w:r>
+          </w:p>
+        </w:tc>
+        <w:tc>
+          <w:tcPr>
+            <w:tcW w:w="0" w:type="auto"/>
+            <w:vAlign w:val="center"/>
+            <w:hideMark/>
+          </w:tcPr>
+          <w:p>
+            <w:pPr>
+              <w:jc w:val="center"/>
+              <w:rPr>
+                <w:b/>
+                <w:bCs/>
+              </w:rPr>
+            </w:pPr>
+            <w:r>
+              <w:rPr>
+                <w:b/>
+                <w:bCs/>
+              </w:rPr>
+              <w:t>Color</w:t>
+            </w:r>
+          </w:p>
+        </w:tc>
+      </w:tr>
+      <w:tr>
+        <w:trPr>
+          <w:tblCellSpacing w:w="15" w:type="dxa"/>
+        </w:trPr>
+        <w:tc>
+          <w:tcPr>
+            <w:tcW w:w="0" w:type="auto"/>
+            <w:vAlign w:val="center"/>
+            <w:hideMark/>
+          </w:tcPr>
+          <w:p>
+            <w:r>
+              <w:t>Éxito</w:t>
+            </w:r>
+          </w:p>
+        </w:tc>
+        <w:tc>
+          <w:tcPr>
+            <w:tcW w:w="0" w:type="auto"/>
+            <w:vAlign w:val="center"/>
+            <w:hideMark/>
+          </w:tcPr>
+          <w:p>
+            <w:r>
+              <w:rPr>
+                <w:rStyle w:val="Textoennegrita"/>
+              </w:rPr>
+              <w:t>#22C55E</w:t>
+            </w:r>
+          </w:p>
+        </w:tc>
+      </w:tr>
+      <w:tr>
+        <w:trPr>
+          <w:tblCellSpacing w:w="15" w:type="dxa"/>
+        </w:trPr>
+        <w:tc>
+          <w:tcPr>
+            <w:tcW w:w="0" w:type="auto"/>
+            <w:vAlign w:val="center"/>
+            <w:hideMark/>
+          </w:tcPr>
+          <w:p>
+            <w:r>
+              <w:t>Advertencia</w:t>
+            </w:r>
+          </w:p>
+        </w:tc>
+        <w:tc>
+          <w:tcPr>
+            <w:tcW w:w="0" w:type="auto"/>
+            <w:vAlign w:val="center"/>
+            <w:hideMark/>
+          </w:tcPr>
+          <w:p>
+            <w:r>
+              <w:rPr>
+                <w:rStyle w:val="Textoennegrita"/>
+              </w:rPr>
+              <w:t>#F59E0B</w:t>
+            </w:r>
+          </w:p>
+        </w:tc>
+      </w:tr>
+      <w:tr>
+        <w:trPr>
+          <w:tblCellSpacing w:w="15" w:type="dxa"/>
+        </w:trPr>
+        <w:tc>
+          <w:tcPr>
+            <w:tcW w:w="0" w:type="auto"/>
+            <w:vAlign w:val="center"/>
+            <w:hideMark/>
+          </w:tcPr>
+          <w:p>
+            <w:r>
+              <w:t>Error</w:t>
+            </w:r>
+          </w:p>
+        </w:tc>
+        <w:tc>
+          <w:tcPr>
+            <w:tcW w:w="0" w:type="auto"/>
+            <w:vAlign w:val="center"/>
+            <w:hideMark/>
+          </w:tcPr>
+          <w:p>
+            <w:r>
+              <w:rPr>
+                <w:rStyle w:val="Textoennegrita"/>
+              </w:rPr>
+              <w:t>#EF4444</w:t>
+            </w:r>
+          </w:p>
+        </w:tc>
+      </w:tr>
+      <w:tr>
+        <w:trPr>
+          <w:tblCellSpacing w:w="15" w:type="dxa"/>
+        </w:trPr>
+        <w:tc>
+          <w:tcPr>
+            <w:tcW w:w="0" w:type="auto"/>
+            <w:vAlign w:val="center"/>
+            <w:hideMark/>
+          </w:tcPr>
+          <w:p>
+            <w:r>
+              <w:t>Información</w:t>
+            </w:r>
+          </w:p>
+        </w:tc>
+        <w:tc>
+          <w:tcPr>
+            <w:tcW w:w="0" w:type="auto"/>
+            <w:vAlign w:val="center"/>
+            <w:hideMark/>
+          </w:tcPr>
+          <w:p>
+            <w:r>
+              <w:rPr>
+                <w:rStyle w:val="Textoennegrita"/>
+              </w:rPr>
+              <w:t>#3B82F6</w:t>
+            </w:r>
+          </w:p>
+        </w:tc>
+      </w:tr>
+    </w:tbl>
+    <w:p>
+      <w:r>
+        <w:pict>
+          <v:rect id="_x0000_i1045" style="width:0;height:1.5pt" o:hralign="center" o:hrstd="t" o:hr="t" fillcolor="#a0a0a0" stroked="f"/>
+        </w:pict>
+      </w:r>
+    </w:p>
+    <w:p>
+      <w:pPr>
+        <w:pStyle w:val="Ttulo1"/>
+      </w:pPr>
+      <w:r>
+        <w:t>Tema claro (Light Theme)</w:t>
+      </w:r>
+    </w:p>
+    <w:tbl>
+      <w:tblPr>
+        <w:tblW w:w="0" w:type="auto"/>
+        <w:tblCellSpacing w:w="15" w:type="dxa"/>
+        <w:tblCellMar>
+          <w:top w:w="15" w:type="dxa"/>
+          <w:left w:w="15" w:type="dxa"/>
+          <w:bottom w:w="15" w:type="dxa"/>
+          <w:right w:w="15" w:type="dxa"/>
+        </w:tblCellMar>
+        <w:tblLook w:val="04A0" w:firstRow="1" w:lastRow="0" w:firstColumn="1" w:lastColumn="0" w:noHBand="0" w:noVBand="1"/>
+      </w:tblPr>
+      <w:tblGrid>
+        <w:gridCol w:w="1724"/>
+        <w:gridCol w:w="938"/>
+      </w:tblGrid>
+      <w:tr>
+        <w:trPr>
+          <w:tblHeader/>
+          <w:tblCellSpacing w:w="15" w:type="dxa"/>
+        </w:trPr>
+        <w:tc>
+          <w:tcPr>
+            <w:tcW w:w="0" w:type="auto"/>
+            <w:vAlign w:val="center"/>
+            <w:hideMark/>
+          </w:tcPr>
+          <w:p>
+            <w:pPr>
+              <w:jc w:val="center"/>
+              <w:rPr>
+                <w:b/>
+                <w:bCs/>
+              </w:rPr>
+            </w:pPr>
+            <w:r>
+              <w:rPr>
+                <w:b/>
+                <w:bCs/>
+              </w:rPr>
+              <w:t>Elemento</w:t>
+            </w:r>
+          </w:p>
+        </w:tc>
+        <w:tc>
+          <w:tcPr>
+            <w:tcW w:w="0" w:type="auto"/>
+            <w:vAlign w:val="center"/>
+            <w:hideMark/>
+          </w:tcPr>
+          <w:p>
+            <w:pPr>
+              <w:jc w:val="center"/>
+              <w:rPr>
+                <w:b/>
+                <w:bCs/>
+              </w:rPr>
+            </w:pPr>
+            <w:r>
+              <w:rPr>
+                <w:b/>
+                <w:bCs/>
+              </w:rPr>
+              <w:t>Color</w:t>
+            </w:r>
+          </w:p>
+        </w:tc>
+      </w:tr>
+      <w:tr>
+        <w:trPr>
+          <w:tblCellSpacing w:w="15" w:type="dxa"/>
+        </w:trPr>
+        <w:tc>
+          <w:tcPr>
+            <w:tcW w:w="0" w:type="auto"/>
+            <w:vAlign w:val="center"/>
+            <w:hideMark/>
+          </w:tcPr>
+          <w:p>
+            <w:r>
+              <w:t>Fondo principal</w:t>
+            </w:r>
+          </w:p>
+        </w:tc>
+        <w:tc>
+          <w:tcPr>
+            <w:tcW w:w="0" w:type="auto"/>
+            <w:vAlign w:val="center"/>
+            <w:hideMark/>
+          </w:tcPr>
+          <w:p>
+            <w:r>
+              <w:rPr>
+                <w:rStyle w:val="Textoennegrita"/>
+              </w:rPr>
+              <w:t>#F8FAFC</w:t>
+            </w:r>
+          </w:p>
+        </w:tc>
+      </w:tr>
+      <w:tr>
+        <w:trPr>
+          <w:tblCellSpacing w:w="15" w:type="dxa"/>
+        </w:trPr>
+        <w:tc>
+          <w:tcPr>
+            <w:tcW w:w="0" w:type="auto"/>
+            <w:vAlign w:val="center"/>
+            <w:hideMark/>
+          </w:tcPr>
+          <w:p>
+            <w:r>
+              <w:t>Tarjetas</w:t>
+            </w:r>
+          </w:p>
+        </w:tc>
+        <w:tc>
+          <w:tcPr>
+            <w:tcW w:w="0" w:type="auto"/>
+            <w:vAlign w:val="center"/>
+            <w:hideMark/>
+          </w:tcPr>
+          <w:p>
+            <w:r>
+              <w:rPr>
+                <w:rStyle w:val="Textoennegrita"/>
+              </w:rPr>
+              <w:t>#FFFFFF</w:t>
+            </w:r>
+          </w:p>
+        </w:tc>
+      </w:tr>
+      <w:tr>
+        <w:trPr>
+          <w:tblCellSpacing w:w="15" w:type="dxa"/>
+        </w:trPr>
+        <w:tc>
+          <w:tcPr>
+            <w:tcW w:w="0" w:type="auto"/>
+            <w:vAlign w:val="center"/>
+            <w:hideMark/>
+          </w:tcPr>
+          <w:p>
+            <w:r>
+              <w:t>Barra lateral</w:t>
+            </w:r>
+          </w:p>
+        </w:tc>
+        <w:tc>
+          <w:tcPr>
+            <w:tcW w:w="0" w:type="auto"/>
+            <w:vAlign w:val="center"/>
+            <w:hideMark/>
+          </w:tcPr>
+          <w:p>
+            <w:r>
+              <w:rPr>
+                <w:rStyle w:val="Textoennegrita"/>
+              </w:rPr>
+              <w:t>#0B2348</w:t>
+            </w:r>
+          </w:p>
+        </w:tc>
+      </w:tr>
+      <w:tr>
+        <w:trPr>
+          <w:tblCellSpacing w:w="15" w:type="dxa"/>
+        </w:trPr>
+        <w:tc>
+          <w:tcPr>
+            <w:tcW w:w="0" w:type="auto"/>
+            <w:vAlign w:val="center"/>
+            <w:hideMark/>
+          </w:tcPr>
+          <w:p>
+            <w:r>
+              <w:t>Barra superior</w:t>
+            </w:r>
+          </w:p>
+        </w:tc>
+        <w:tc>
+          <w:tcPr>
+            <w:tcW w:w="0" w:type="auto"/>
+            <w:vAlign w:val="center"/>
+            <w:hideMark/>
+          </w:tcPr>
+          <w:p>
+            <w:r>
+              <w:rPr>
+                <w:rStyle w:val="Textoennegrita"/>
+              </w:rPr>
+              <w:t>#FFFFFF</w:t>
+            </w:r>
+          </w:p>
+        </w:tc>
+      </w:tr>
+      <w:tr>
+        <w:trPr>
+          <w:tblCellSpacing w:w="15" w:type="dxa"/>
+        </w:trPr>
+        <w:tc>
+          <w:tcPr>
+            <w:tcW w:w="0" w:type="auto"/>
+            <w:vAlign w:val="center"/>
+            <w:hideMark/>
+          </w:tcPr>
+          <w:p>
+            <w:r>
+              <w:t>Texto principal</w:t>
+            </w:r>
+          </w:p>
+        </w:tc>
+        <w:tc>
+          <w:tcPr>
+            <w:tcW w:w="0" w:type="auto"/>
+            <w:vAlign w:val="center"/>
+            <w:hideMark/>
+          </w:tcPr>
+          <w:p>
+            <w:r>
+              <w:rPr>
+                <w:rStyle w:val="Textoennegrita"/>
+              </w:rPr>
+              <w:t>#111827</w:t>
+            </w:r>
+          </w:p>
+        </w:tc>
+      </w:tr>
+      <w:tr>
+        <w:trPr>
+          <w:tblCellSpacing w:w="15" w:type="dxa"/>
+        </w:trPr>
+        <w:tc>
+          <w:tcPr>
+            <w:tcW w:w="0" w:type="auto"/>
+            <w:vAlign w:val="center"/>
+            <w:hideMark/>
+          </w:tcPr>
+          <w:p>
+            <w:r>
+              <w:t>Texto secundario</w:t>
+            </w:r>
+          </w:p>
+        </w:tc>
+        <w:tc>
+          <w:tcPr>
+            <w:tcW w:w="0" w:type="auto"/>
+            <w:vAlign w:val="center"/>
+            <w:hideMark/>
+          </w:tcPr>
+          <w:p>
+            <w:r>
+              <w:rPr>
+                <w:rStyle w:val="Textoennegrita"/>
+              </w:rPr>
+              <w:t>#6B7280</w:t>
+            </w:r>
+          </w:p>
+        </w:tc>
+      </w:tr>
+      <w:tr>
+        <w:trPr>
+          <w:tblCellSpacing w:w="15" w:type="dxa"/>
+        </w:trPr>
+        <w:tc>
+          <w:tcPr>
+            <w:tcW w:w="0" w:type="auto"/>
+            <w:vAlign w:val="center"/>
+            <w:hideMark/>
+          </w:tcPr>
+          <w:p>
+            <w:r>
+              <w:t>Bordes</w:t>
+            </w:r>
+          </w:p>
+        </w:tc>
+        <w:tc>
+          <w:tcPr>
+            <w:tcW w:w="0" w:type="auto"/>
+            <w:vAlign w:val="center"/>
+            <w:hideMark/>
+          </w:tcPr>
+          <w:p>
+            <w:r>
+              <w:rPr>
+                <w:rStyle w:val="Textoennegrita"/>
+              </w:rPr>
+              <w:t>#E5E7EB</w:t>
+            </w:r>
+          </w:p>
+        </w:tc>
+      </w:tr>
+    </w:tbl>
+    <w:p>
+      <w:r>
+        <w:pict>
+          <v:rect id="_x0000_i1046" style="width:0;height:1.5pt" o:hralign="center" o:hrstd="t" o:hr="t" fillcolor="#a0a0a0" stroked="f"/>
+        </w:pict>
+      </w:r>
+    </w:p>
+    <w:p>
+      <w:pPr>
+        <w:pStyle w:val="Ttulo1"/>
+      </w:pPr>
+      <w:r>
+        <w:t>Botones</w:t>
+      </w:r>
+    </w:p>
+    <w:p>
+      <w:pPr>
+        <w:pStyle w:val="Ttulo3"/>
+      </w:pPr>
+      <w:r>
+        <w:t>Botón Primario</w:t>
+      </w:r>
+    </w:p>
+    <w:p>
+      <w:pPr>
+        <w:pStyle w:val="HTMLconformatoprevio"/>
+      </w:pPr>
+      <w:r>
+        <w:rPr>
+          <w:rStyle w:val="o"/>
+        </w:rPr>
+        <w:t>background</w:t>
+      </w:r>
+      <w:r>
+        <w:rPr>
+          <w:rStyle w:val="CdigoHTML"/>
+        </w:rPr>
+        <w:t xml:space="preserve">: </w:t>
+      </w:r>
+      <w:r>
+        <w:rPr>
+          <w:rStyle w:val="g"/>
+        </w:rPr>
+        <w:t>#</w:t>
+      </w:r>
+      <w:r>
+        <w:rPr>
+          <w:rStyle w:val="o"/>
+        </w:rPr>
+        <w:t>FF7A00</w:t>
+      </w:r>
+      <w:r>
+        <w:rPr>
+          <w:rStyle w:val="CdigoHTML"/>
+        </w:rPr>
+        <w:t>;</w:t>
+      </w:r>
+      <w:r>
+        <w:br/>
+      </w:r>
+      <w:r>
+        <w:rPr>
+          <w:rStyle w:val="o"/>
+        </w:rPr>
+        <w:t>color</w:t>
+      </w:r>
+      <w:r>
+        <w:rPr>
+          <w:rStyle w:val="CdigoHTML"/>
+        </w:rPr>
+        <w:t xml:space="preserve">: </w:t>
+      </w:r>
+      <w:r>
+        <w:rPr>
+          <w:rStyle w:val="g"/>
+        </w:rPr>
+        <w:t>#</w:t>
+      </w:r>
+      <w:r>
+        <w:rPr>
+          <w:rStyle w:val="o"/>
+        </w:rPr>
+        <w:t>FFFFFF</w:t>
+      </w:r>
+      <w:r>
+        <w:rPr>
+          <w:rStyle w:val="CdigoHTML"/>
+        </w:rPr>
+        <w:t>;</w:t>
+      </w:r>
+    </w:p>
+    <w:p>
+      <w:pPr>
+        <w:pStyle w:val="NormalWeb"/>
+      </w:pPr>
+      <w:r>
+        <w:lastRenderedPageBreak/>
+        <w:t>Hover</w:t>
+      </w:r>
+    </w:p>
+    <w:p>
+      <w:pPr>
+        <w:pStyle w:val="HTMLconformatoprevio"/>
+      </w:pPr>
+      <w:r>
+        <w:rPr>
+          <w:rStyle w:val="o"/>
+        </w:rPr>
+        <w:t>background</w:t>
+      </w:r>
+      <w:r>
+        <w:rPr>
+          <w:rStyle w:val="CdigoHTML"/>
+        </w:rPr>
+        <w:t xml:space="preserve">: </w:t>
+      </w:r>
+      <w:r>
+        <w:rPr>
+          <w:rStyle w:val="g"/>
+        </w:rPr>
+        <w:t>#</w:t>
+      </w:r>
+      <w:r>
+        <w:rPr>
+          <w:rStyle w:val="o"/>
+        </w:rPr>
+        <w:t>E86D00</w:t>
+      </w:r>
+      <w:r>
+        <w:rPr>
+          <w:rStyle w:val="CdigoHTML"/>
+        </w:rPr>
+        <w:t>;</w:t>
+      </w:r>
+    </w:p>
+    <w:p>
+      <w:r>
+        <w:rPr>
+          <w:noProof/>
+        </w:rPr>
+        <w:pict>
+          <v:rect id="_x0000_i1051" alt="" style="width:441.9pt;height:.05pt;mso-width-percent:0;mso-height-percent:0;mso-width-percent:0;mso-height-percent:0" o:hralign="center" o:hrstd="t" o:hr="t" fillcolor="#a0a0a0" stroked="f"/>
+        </w:pict>
+      </w:r>
+    </w:p>
+    <w:p>
+      <w:pPr>
+        <w:pStyle w:val="Ttulo3"/>
+      </w:pPr>
+      <w:r>
+        <w:t>Botón Secundario</w:t>
+      </w:r>
+    </w:p>
+    <w:p>
+      <w:pPr>
+        <w:pStyle w:val="HTMLconformatoprevio"/>
+      </w:pPr>
+      <w:r>
+        <w:rPr>
+          <w:rStyle w:val="o"/>
+        </w:rPr>
+        <w:t>background</w:t>
+      </w:r>
+      <w:r>
+        <w:rPr>
+          <w:rStyle w:val="CdigoHTML"/>
+        </w:rPr>
+        <w:t xml:space="preserve">: </w:t>
+      </w:r>
+      <w:r>
+        <w:rPr>
+          <w:rStyle w:val="g"/>
+        </w:rPr>
+        <w:t>#</w:t>
+      </w:r>
+      <w:r>
+        <w:rPr>
+          <w:rStyle w:val="CdigoHTML"/>
+        </w:rPr>
+        <w:t>0</w:t>
+      </w:r>
+      <w:r>
+        <w:rPr>
+          <w:rStyle w:val="o"/>
+        </w:rPr>
+        <w:t>B2348</w:t>
+      </w:r>
+      <w:r>
+        <w:rPr>
+          <w:rStyle w:val="CdigoHTML"/>
+        </w:rPr>
+        <w:t>;</w:t>
+      </w:r>
+      <w:r>
+        <w:br/>
+      </w:r>
+      <w:r>
+        <w:rPr>
+          <w:rStyle w:val="o"/>
+        </w:rPr>
+        <w:t>color</w:t>
+      </w:r>
+      <w:r>
+        <w:rPr>
+          <w:rStyle w:val="CdigoHTML"/>
+        </w:rPr>
+        <w:t xml:space="preserve">: </w:t>
+      </w:r>
+      <w:r>
+        <w:rPr>
+          <w:rStyle w:val="l"/>
+        </w:rPr>
+        <w:t>white</w:t>
+      </w:r>
+      <w:r>
+        <w:rPr>
+          <w:rStyle w:val="CdigoHTML"/>
+        </w:rPr>
+        <w:t>;</w:t>
+      </w:r>
+    </w:p>
+    <w:p>
+      <w:pPr>
+        <w:pStyle w:val="NormalWeb"/>
+      </w:pPr>
+      <w:r>
+        <w:t>Hover</w:t>
+      </w:r>
+    </w:p>
+    <w:p>
+      <w:pPr>
+        <w:pStyle w:val="HTMLconformatoprevio"/>
+      </w:pPr>
+      <w:r>
+        <w:rPr>
+          <w:rStyle w:val="o"/>
+        </w:rPr>
+        <w:t>background</w:t>
+      </w:r>
+      <w:r>
+        <w:rPr>
+          <w:rStyle w:val="CdigoHTML"/>
+        </w:rPr>
+        <w:t xml:space="preserve">: </w:t>
+      </w:r>
+      <w:r>
+        <w:rPr>
+          <w:rStyle w:val="g"/>
+        </w:rPr>
+        <w:t>#</w:t>
+      </w:r>
+      <w:r>
+        <w:rPr>
+          <w:rStyle w:val="CdigoHTML"/>
+        </w:rPr>
+        <w:t>12386</w:t>
+      </w:r>
+      <w:r>
+        <w:rPr>
+          <w:rStyle w:val="o"/>
+        </w:rPr>
+        <w:t>B</w:t>
+      </w:r>
+      <w:r>
+        <w:rPr>
+          <w:rStyle w:val="CdigoHTML"/>
+        </w:rPr>
+        <w:t>;</w:t>
+      </w:r>
+    </w:p>
+    <w:p>
+      <w:r>
+        <w:rPr>
+          <w:noProof/>
+        </w:rPr>
+        <w:pict>
+          <v:rect id="_x0000_i1050" alt="" style="width:441.9pt;height:.05pt;mso-width-percent:0;mso-height-percent:0;mso-width-percent:0;mso-height-percent:0" o:hralign="center" o:hrstd="t" o:hr="t" fillcolor="#a0a0a0" stroked="f"/>
+        </w:pict>
+      </w:r>
+    </w:p>
+    <w:p>
+      <w:pPr>
+        <w:pStyle w:val="Ttulo1"/>
+      </w:pPr>
+      <w:r>
+        <w:t>Dashboard</w:t>
+      </w:r>
+    </w:p>
+    <w:tbl>
+      <w:tblPr>
+        <w:tblW w:w="0" w:type="auto"/>
+        <w:tblCellSpacing w:w="15" w:type="dxa"/>
+        <w:tblCellMar>
+          <w:top w:w="15" w:type="dxa"/>
+          <w:left w:w="15" w:type="dxa"/>
+          <w:bottom w:w="15" w:type="dxa"/>
+          <w:right w:w="15" w:type="dxa"/>
+        </w:tblCellMar>
+        <w:tblLook w:val="04A0" w:firstRow="1" w:lastRow="0" w:firstColumn="1" w:lastColumn="0" w:noHBand="0" w:noVBand="1"/>
+      </w:tblPr>
+      <w:tblGrid>
+        <w:gridCol w:w="1440"/>
+        <w:gridCol w:w="1479"/>
+      </w:tblGrid>
+      <w:tr>
+        <w:trPr>
+          <w:tblHeader/>
+          <w:tblCellSpacing w:w="15" w:type="dxa"/>
+        </w:trPr>
+        <w:tc>
+          <w:tcPr>
+            <w:tcW w:w="0" w:type="auto"/>
+            <w:vAlign w:val="center"/>
+            <w:hideMark/>
+          </w:tcPr>
+          <w:p>
+            <w:pPr>
+              <w:jc w:val="center"/>
+              <w:rPr>
+                <w:b/>
+                <w:bCs/>
+              </w:rPr>
+            </w:pPr>
+            <w:r>
+              <w:rPr>
+                <w:b/>
+                <w:bCs/>
+              </w:rPr>
+              <w:t>Elemento</w:t>
+            </w:r>
+          </w:p>
+        </w:tc>
+        <w:tc>
+          <w:tcPr>
+            <w:tcW w:w="0" w:type="auto"/>
+            <w:vAlign w:val="center"/>
+            <w:hideMark/>
+          </w:tcPr>
+          <w:p>
+            <w:pPr>
+              <w:jc w:val="center"/>
+              <w:rPr>
+                <w:b/>
+                <w:bCs/>
+              </w:rPr>
+            </w:pPr>
+            <w:r>
+              <w:rPr>
+                <w:b/>
+                <w:bCs/>
+              </w:rPr>
+              <w:t>Color</w:t>
+            </w:r>
+          </w:p>
+        </w:tc>
+      </w:tr>
+      <w:tr>
+        <w:trPr>
+          <w:tblCellSpacing w:w="15" w:type="dxa"/>
+        </w:trPr>
+        <w:tc>
+          <w:tcPr>
+            <w:tcW w:w="0" w:type="auto"/>
+            <w:vAlign w:val="center"/>
+            <w:hideMark/>
+          </w:tcPr>
+          <w:p>
+            <w:r>
+              <w:t>Sidebar</w:t>
+            </w:r>
+          </w:p>
+        </w:tc>
+        <w:tc>
+          <w:tcPr>
+            <w:tcW w:w="0" w:type="auto"/>
+            <w:vAlign w:val="center"/>
+            <w:hideMark/>
+          </w:tcPr>
+          <w:p>
+            <w:r>
+              <w:rPr>
+                <w:rStyle w:val="Textoennegrita"/>
+              </w:rPr>
+              <w:t>#0B2348</w:t>
+            </w:r>
+          </w:p>
+        </w:tc>
+      </w:tr>
+      <w:tr>
+        <w:trPr>
+          <w:tblCellSpacing w:w="15" w:type="dxa"/>
+        </w:trPr>
+        <w:tc>
+          <w:tcPr>
+            <w:tcW w:w="0" w:type="auto"/>
+            <w:vAlign w:val="center"/>
+            <w:hideMark/>
+          </w:tcPr>
+          <w:p>
+            <w:r>
+              <w:t>Iconos activos</w:t>
+            </w:r>
+          </w:p>
+        </w:tc>
+        <w:tc>
+          <w:tcPr>
+            <w:tcW w:w="0" w:type="auto"/>
+            <w:vAlign w:val="center"/>
+            <w:hideMark/>
+          </w:tcPr>
+          <w:p>
+            <w:r>
+              <w:rPr>
+                <w:rStyle w:val="Textoennegrita"/>
+              </w:rPr>
+              <w:t>#FF7A00</w:t>
+            </w:r>
+          </w:p>
+        </w:tc>
+      </w:tr>
+      <w:tr>
+        <w:trPr>
+          <w:tblCellSpacing w:w="15" w:type="dxa"/>
+        </w:trPr>
+        <w:tc>
+          <w:tcPr>
+            <w:tcW w:w="0" w:type="auto"/>
+            <w:vAlign w:val="center"/>
+            <w:hideMark/>
+          </w:tcPr>
+          <w:p>
+            <w:r>
+              <w:t>Cards</w:t>
+            </w:r>
+          </w:p>
+        </w:tc>
+        <w:tc>
+          <w:tcPr>
+            <w:tcW w:w="0" w:type="auto"/>
+            <w:vAlign w:val="center"/>
+            <w:hideMark/>
+          </w:tcPr>
+          <w:p>
+            <w:r>
+              <w:rPr>
+                <w:rStyle w:val="Textoennegrita"/>
+              </w:rPr>
+              <w:t>#FFFFFF</w:t>
+            </w:r>
+          </w:p>
+        </w:tc>
+      </w:tr>
+      <w:tr>
+        <w:trPr>
+          <w:tblCellSpacing w:w="15" w:type="dxa"/>
+        </w:trPr>
+        <w:tc>
+          <w:tcPr>
+            <w:tcW w:w="0" w:type="auto"/>
+            <w:vAlign w:val="center"/>
+            <w:hideMark/>
+          </w:tcPr>
+          <w:p>
+            <w:r>
+              <w:t>Fondo</w:t>
+            </w:r>
+          </w:p>
+        </w:tc>
+        <w:tc>
+          <w:tcPr>
+            <w:tcW w:w="0" w:type="auto"/>
+            <w:vAlign w:val="center"/>
+            <w:hideMark/>
+          </w:tcPr>
+          <w:p>
+            <w:r>
+              <w:rPr>
+                <w:rStyle w:val="Textoennegrita"/>
+              </w:rPr>
+              <w:t>#F8FAFC</w:t>
+            </w:r>
+          </w:p>
+        </w:tc>
+      </w:tr>
+      <w:tr>
+        <w:trPr>
+          <w:tblCellSpacing w:w="15" w:type="dxa"/>
+        </w:trPr>
+        <w:tc>
+          <w:tcPr>
+            <w:tcW w:w="0" w:type="auto"/>
+            <w:vAlign w:val="center"/>
+            <w:hideMark/>
+          </w:tcPr>
+          <w:p>
+            <w:r>
+              <w:t>Gráficas</w:t>
+            </w:r>
+          </w:p>
+        </w:tc>
+        <w:tc>
+          <w:tcPr>
+            <w:tcW w:w="0" w:type="auto"/>
+            <w:vAlign w:val="center"/>
+            <w:hideMark/>
+          </w:tcPr>
+          <w:p>
+            <w:r>
+              <w:t>Azul + Naranja</w:t>
+            </w:r>
+          </w:p>
+        </w:tc>
+      </w:tr>
+    </w:tbl>
+    <w:p>
+      <w:r>
+        <w:rPr>
+          <w:noProof/>
+        </w:rPr>
+        <w:pict>
+          <v:rect id="_x0000_i1049" alt="" style="width:441.9pt;height:.05pt;mso-width-percent:0;mso-height-percent:0;mso-width-percent:0;mso-height-percent:0" o:hralign="center" o:hrstd="t" o:hr="t" fillcolor="#a0a0a0" stroked="f"/>
+        </w:pict>
+      </w:r>
+    </w:p>
+    <w:p>
+      <w:pPr>
+        <w:pStyle w:val="Ttulo1"/>
+      </w:pPr>
+      <w:r>
+        <w:t>Formularios</w:t>
+      </w:r>
+    </w:p>
+    <w:p>
+      <w:pPr>
+        <w:pStyle w:val="NormalWeb"/>
+      </w:pPr>
+      <w:r>
+        <w:t>Input</w:t>
+      </w:r>
+    </w:p>
+    <w:p>
+      <w:pPr>
+        <w:pStyle w:val="HTMLconformatoprevio"/>
+      </w:pPr>
+      <w:r>
+        <w:rPr>
+          <w:rStyle w:val="o"/>
+        </w:rPr>
+        <w:t>background</w:t>
+      </w:r>
+      <w:r>
+        <w:rPr>
+          <w:rStyle w:val="CdigoHTML"/>
+        </w:rPr>
+        <w:t xml:space="preserve">: </w:t>
+      </w:r>
+      <w:r>
+        <w:rPr>
+          <w:rStyle w:val="l"/>
+        </w:rPr>
+        <w:t>white</w:t>
+      </w:r>
+      <w:r>
+        <w:rPr>
+          <w:rStyle w:val="CdigoHTML"/>
+        </w:rPr>
+        <w:t>;</w:t>
+      </w:r>
+      <w:r>
+        <w:br/>
+      </w:r>
+      <w:r>
+        <w:rPr>
+          <w:rStyle w:val="o"/>
+        </w:rPr>
+        <w:t>border</w:t>
+      </w:r>
+      <w:r>
+        <w:rPr>
+          <w:rStyle w:val="CdigoHTML"/>
+        </w:rPr>
+        <w:t>: 1</w:t>
+      </w:r>
+      <w:r>
+        <w:rPr>
+          <w:rStyle w:val="l"/>
+        </w:rPr>
+        <w:t>px</w:t>
+      </w:r>
+      <w:r>
+        <w:rPr>
+          <w:rStyle w:val="CdigoHTML"/>
+        </w:rPr>
+        <w:t xml:space="preserve"> </w:t>
+      </w:r>
+      <w:r>
+        <w:rPr>
+          <w:rStyle w:val="o"/>
+        </w:rPr>
+        <w:t>solid</w:t>
+      </w:r>
+      <w:r>
+        <w:rPr>
+          <w:rStyle w:val="CdigoHTML"/>
+        </w:rPr>
+        <w:t xml:space="preserve"> </w:t>
+      </w:r>
+      <w:r>
+        <w:rPr>
+          <w:rStyle w:val="g"/>
+        </w:rPr>
+        <w:t>#</w:t>
+      </w:r>
+      <w:r>
+        <w:rPr>
+          <w:rStyle w:val="o"/>
+        </w:rPr>
+        <w:t>D1D5DB</w:t>
+      </w:r>
+      <w:r>
+        <w:rPr>
+          <w:rStyle w:val="CdigoHTML"/>
+        </w:rPr>
+        <w:t>;</w:t>
+      </w:r>
+    </w:p>
+    <w:p>
+      <w:pPr>
+        <w:pStyle w:val="NormalWeb"/>
+      </w:pPr>
+      <w:r>
+        <w:t>Focus</w:t>
+      </w:r>
+    </w:p>
+    <w:p>
+      <w:pPr>
+        <w:pStyle w:val="HTMLconformatoprevio"/>
+      </w:pPr>
+      <w:r>
+        <w:rPr>
+          <w:rStyle w:val="o"/>
+        </w:rPr>
+        <w:t>border</w:t>
+      </w:r>
+      <w:r>
+        <w:rPr>
+          <w:rStyle w:val="CdigoHTML"/>
+        </w:rPr>
+        <w:t xml:space="preserve">: </w:t>
+      </w:r>
+      <w:r>
+        <w:rPr>
+          <w:rStyle w:val="g"/>
+        </w:rPr>
+        <w:t>#</w:t>
+      </w:r>
+      <w:r>
+        <w:rPr>
+          <w:rStyle w:val="o"/>
+        </w:rPr>
+        <w:t>FF7A00</w:t>
+      </w:r>
+      <w:r>
+        <w:rPr>
+          <w:rStyle w:val="CdigoHTML"/>
+        </w:rPr>
+        <w:t>;</w:t>
+      </w:r>
+      <w:r>
+        <w:br/>
+      </w:r>
+      <w:r>
+        <w:rPr>
+          <w:rStyle w:val="o"/>
+        </w:rPr>
+        <w:t>box-shadow</w:t>
+      </w:r>
+      <w:r>
+        <w:rPr>
+          <w:rStyle w:val="CdigoHTML"/>
+        </w:rPr>
+        <w:t>: 0 0 0 4</w:t>
+      </w:r>
+      <w:r>
+        <w:rPr>
+          <w:rStyle w:val="l"/>
+        </w:rPr>
+        <w:t>px</w:t>
+      </w:r>
+      <w:r>
+        <w:rPr>
+          <w:rStyle w:val="CdigoHTML"/>
+        </w:rPr>
+        <w:t xml:space="preserve"> </w:t>
+      </w:r>
+      <w:r>
+        <w:rPr>
+          <w:rStyle w:val="l"/>
+        </w:rPr>
+        <w:t>rgba</w:t>
+      </w:r>
+      <w:r>
+        <w:rPr>
+          <w:rStyle w:val="CdigoHTML"/>
+        </w:rPr>
+        <w:t>(255,122,0,.15);</w:t>
+      </w:r>
+    </w:p>
+    <w:p>
+      <w:r>
+        <w:rPr>
+          <w:noProof/>
+        </w:rPr>
+        <w:pict>
+          <v:rect id="_x0000_i1048" alt="" style="width:441.9pt;height:.05pt;mso-width-percent:0;mso-height-percent:0;mso-width-percent:0;mso-height-percent:0" o:hralign="center" o:hrstd="t" o:hr="t" fillcolor="#a0a0a0" stroked="f"/>
+        </w:pict>
+      </w:r>
+    </w:p>
+    <w:p>
+      <w:pPr>
+        <w:pStyle w:val="Ttulo1"/>
+      </w:pPr>
+      <w:r>
+        <w:t>Tablas</w:t>
+      </w:r>
+    </w:p>
+    <w:p>
+      <w:pPr>
+        <w:pStyle w:val="NormalWeb"/>
+      </w:pPr>
+      <w:r>
+        <w:t>Encabezado</w:t>
+      </w:r>
+    </w:p>
+    <w:p>
+      <w:pPr>
+        <w:pStyle w:val="HTMLconformatoprevio"/>
+      </w:pPr>
+      <w:r>
+        <w:rPr>
+          <w:rStyle w:val="o"/>
+        </w:rPr>
+        <w:t>background</w:t>
+      </w:r>
+      <w:r>
+        <w:rPr>
+          <w:rStyle w:val="CdigoHTML"/>
+        </w:rPr>
+        <w:t xml:space="preserve">: </w:t>
+      </w:r>
+      <w:r>
+        <w:rPr>
+          <w:rStyle w:val="g"/>
+        </w:rPr>
+        <w:t>#</w:t>
+      </w:r>
+      <w:r>
+        <w:rPr>
+          <w:rStyle w:val="CdigoHTML"/>
+        </w:rPr>
+        <w:t>0</w:t>
+      </w:r>
+      <w:r>
+        <w:rPr>
+          <w:rStyle w:val="o"/>
+        </w:rPr>
+        <w:t>B2348</w:t>
+      </w:r>
+      <w:r>
+        <w:rPr>
+          <w:rStyle w:val="CdigoHTML"/>
+        </w:rPr>
+        <w:t>;</w:t>
+      </w:r>
+      <w:r>
+        <w:br/>
+      </w:r>
+      <w:r>
+        <w:rPr>
+          <w:rStyle w:val="o"/>
+        </w:rPr>
+        <w:t>color</w:t>
+      </w:r>
+      <w:r>
+        <w:rPr>
+          <w:rStyle w:val="CdigoHTML"/>
+        </w:rPr>
+        <w:t xml:space="preserve">: </w:t>
+      </w:r>
+      <w:r>
+        <w:rPr>
+          <w:rStyle w:val="l"/>
+        </w:rPr>
+        <w:t>white</w:t>
+      </w:r>
+      <w:r>
+        <w:rPr>
+          <w:rStyle w:val="CdigoHTML"/>
+        </w:rPr>
+        <w:t>;</w:t>
+      </w:r>
+    </w:p>
+    <w:p>
+      <w:pPr>
+        <w:pStyle w:val="NormalWeb"/>
+      </w:pPr>
+      <w:r>
+        <w:lastRenderedPageBreak/>
+        <w:t>Fila Hover</w:t>
+      </w:r>
+    </w:p>
+    <w:p>
+      <w:pPr>
+        <w:pStyle w:val="HTMLconformatoprevio"/>
+      </w:pPr>
+      <w:r>
+        <w:rPr>
+          <w:rStyle w:val="o"/>
+        </w:rPr>
+        <w:t>background</w:t>
+      </w:r>
+      <w:r>
+        <w:rPr>
+          <w:rStyle w:val="CdigoHTML"/>
+        </w:rPr>
+        <w:t xml:space="preserve">: </w:t>
+      </w:r>
+      <w:r>
+        <w:rPr>
+          <w:rStyle w:val="g"/>
+        </w:rPr>
+        <w:t>#</w:t>
+      </w:r>
+      <w:r>
+        <w:rPr>
+          <w:rStyle w:val="o"/>
+        </w:rPr>
+        <w:t>FFF7ED</w:t>
+      </w:r>
+      <w:r>
+        <w:rPr>
+          <w:rStyle w:val="CdigoHTML"/>
+        </w:rPr>
+        <w:t>;</w:t>
+      </w:r>
+    </w:p>
+    <w:p>
+      <w:r>
+        <w:rPr>
+          <w:noProof/>
+        </w:rPr>
+        <w:pict>
+          <v:rect id="_x0000_i1047" alt="" style="width:441.9pt;height:.05pt;mso-width-percent:0;mso-height-percent:0;mso-width-percent:0;mso-height-percent:0" o:hralign="center" o:hrstd="t" o:hr="t" fillcolor="#a0a0a0" stroked="f"/>
+        </w:pict>
+      </w:r>
+    </w:p>
+    <w:p>
+      <w:pPr>
+        <w:pStyle w:val="Ttulo1"/>
+        <w:rPr>
+          <w:lang w:val="en-US"/>
+        </w:rPr>
+      </w:pPr>
+      <w:r>
+        <w:rPr>
+          <w:lang w:val="en-US"/>
+        </w:rPr>
+        <w:t>Variables CSS</w:t>
+      </w:r>
+    </w:p>
+    <w:p>
+      <w:pPr>
+        <w:pStyle w:val="HTMLconformatoprevio"/>
+        <w:rPr>
+          <w:lang w:val="en-US"/>
+        </w:rPr>
+      </w:pPr>
+      <w:r>
+        <w:rPr>
+          <w:rStyle w:val="CdigoHTML"/>
+          <w:lang w:val="en-US"/>
+        </w:rPr>
+        <w:t>:</w:t>
+      </w:r>
+      <w:r>
+        <w:rPr>
+          <w:rStyle w:val="l"/>
+          <w:lang w:val="en-US"/>
+        </w:rPr>
+        <w:t>root</w:t>
+      </w:r>
+      <w:r>
+        <w:rPr>
+          <w:rStyle w:val="CdigoHTML"/>
+          <w:lang w:val="en-US"/>
+        </w:rPr>
+        <w:t>{</w:t>
+      </w:r>
+      <w:r>
+        <w:rPr>
+          <w:lang w:val="en-US"/>
+        </w:rPr>
+        <w:br/>
+      </w:r>
+      <w:r>
+        <w:rPr>
+          <w:lang w:val="en-US"/>
+        </w:rPr>
+        <w:br/>
+      </w:r>
+      <w:r>
+        <w:rPr>
+          <w:rStyle w:val="m"/>
+          <w:rFonts w:eastAsiaTheme="majorEastAsia"/>
+          <w:lang w:val="en-US"/>
+        </w:rPr>
+        <w:t>--primary</w:t>
+      </w:r>
+      <w:r>
+        <w:rPr>
+          <w:rStyle w:val="CdigoHTML"/>
+          <w:lang w:val="en-US"/>
+        </w:rPr>
+        <w:t>:#0B2348;</w:t>
+      </w:r>
+      <w:r>
+        <w:rPr>
+          <w:lang w:val="en-US"/>
+        </w:rPr>
+        <w:br/>
+      </w:r>
+      <w:r>
+        <w:rPr>
+          <w:rStyle w:val="m"/>
+          <w:rFonts w:eastAsiaTheme="majorEastAsia"/>
+          <w:lang w:val="en-US"/>
+        </w:rPr>
+        <w:t>--primary-light</w:t>
+      </w:r>
+      <w:r>
+        <w:rPr>
+          <w:rStyle w:val="CdigoHTML"/>
+          <w:lang w:val="en-US"/>
+        </w:rPr>
+        <w:t>:#12386B;</w:t>
+      </w:r>
+      <w:r>
+        <w:rPr>
+          <w:lang w:val="en-US"/>
+        </w:rPr>
+        <w:br/>
+      </w:r>
+      <w:r>
+        <w:rPr>
+          <w:lang w:val="en-US"/>
+        </w:rPr>
+        <w:br/>
+      </w:r>
+      <w:r>
+        <w:rPr>
+          <w:rStyle w:val="m"/>
+          <w:rFonts w:eastAsiaTheme="majorEastAsia"/>
+          <w:lang w:val="en-US"/>
+        </w:rPr>
+        <w:t>--secondary</w:t>
+      </w:r>
+      <w:r>
+        <w:rPr>
+          <w:rStyle w:val="CdigoHTML"/>
+          <w:lang w:val="en-US"/>
+        </w:rPr>
+        <w:t>:#FF7A00;</w:t>
+      </w:r>
+      <w:r>
+        <w:rPr>
+          <w:lang w:val="en-US"/>
+        </w:rPr>
+        <w:br/>
+      </w:r>
+      <w:r>
+        <w:rPr>
+          <w:rStyle w:val="m"/>
+          <w:rFonts w:eastAsiaTheme="majorEastAsia"/>
+          <w:lang w:val="en-US"/>
+        </w:rPr>
+        <w:t>--secondary-light</w:t>
+      </w:r>
+      <w:r>
+        <w:rPr>
+          <w:rStyle w:val="CdigoHTML"/>
+          <w:lang w:val="en-US"/>
+        </w:rPr>
+        <w:t>:#FF9B2F;</w:t>
+      </w:r>
+      <w:r>
+        <w:rPr>
+          <w:lang w:val="en-US"/>
+        </w:rPr>
+        <w:br/>
+      </w:r>
+      <w:r>
+        <w:rPr>
+          <w:lang w:val="en-US"/>
+        </w:rPr>
+        <w:br/>
+      </w:r>
+      <w:r>
+        <w:rPr>
+          <w:rStyle w:val="m"/>
+          <w:rFonts w:eastAsiaTheme="majorEastAsia"/>
+          <w:lang w:val="en-US"/>
+        </w:rPr>
+        <w:t>--success</w:t>
+      </w:r>
+      <w:r>
+        <w:rPr>
+          <w:rStyle w:val="CdigoHTML"/>
+          <w:lang w:val="en-US"/>
+        </w:rPr>
+        <w:t>:#22C55E;</w:t>
+      </w:r>
+      <w:r>
+        <w:rPr>
+          <w:lang w:val="en-US"/>
+        </w:rPr>
+        <w:br/>
+      </w:r>
+      <w:r>
+        <w:rPr>
+          <w:rStyle w:val="m"/>
+          <w:rFonts w:eastAsiaTheme="majorEastAsia"/>
+          <w:lang w:val="en-US"/>
+        </w:rPr>
+        <w:t>--warning</w:t>
+      </w:r>
+      <w:r>
+        <w:rPr>
+          <w:rStyle w:val="CdigoHTML"/>
+          <w:lang w:val="en-US"/>
+        </w:rPr>
+        <w:t>:#F59E0B;</w:t>
+      </w:r>
+      <w:r>
+        <w:rPr>
+          <w:lang w:val="en-US"/>
+        </w:rPr>
+        <w:br/>
+      </w:r>
+      <w:r>
+        <w:rPr>
+          <w:rStyle w:val="m"/>
+          <w:rFonts w:eastAsiaTheme="majorEastAsia"/>
+          <w:lang w:val="en-US"/>
+        </w:rPr>
+        <w:t>--danger</w:t>
+      </w:r>
+      <w:r>
+        <w:rPr>
+          <w:rStyle w:val="CdigoHTML"/>
+          <w:lang w:val="en-US"/>
+        </w:rPr>
+        <w:t>:#EF4444;</w:t>
+      </w:r>
+      <w:r>
+        <w:rPr>
+          <w:lang w:val="en-US"/>
+        </w:rPr>
+        <w:br/>
+      </w:r>
+      <w:r>
+        <w:rPr>
+          <w:rStyle w:val="m"/>
+          <w:rFonts w:eastAsiaTheme="majorEastAsia"/>
+          <w:lang w:val="en-US"/>
+        </w:rPr>
+        <w:t>--info</w:t>
+      </w:r>
+      <w:r>
+        <w:rPr>
+          <w:rStyle w:val="CdigoHTML"/>
+          <w:lang w:val="en-US"/>
+        </w:rPr>
+        <w:t>:#3B82F6;</w:t>
+      </w:r>
+      <w:r>
+        <w:rPr>
+          <w:lang w:val="en-US"/>
+        </w:rPr>
+        <w:br/>
+      </w:r>
+      <w:r>
+        <w:rPr>
+          <w:lang w:val="en-US"/>
+        </w:rPr>
+        <w:br/>
+      </w:r>
+      <w:r>
+        <w:rPr>
+          <w:rStyle w:val="m"/>
+          <w:rFonts w:eastAsiaTheme="majorEastAsia"/>
+          <w:lang w:val="en-US"/>
+        </w:rPr>
+        <w:t>--background</w:t>
+      </w:r>
+      <w:r>
+        <w:rPr>
+          <w:rStyle w:val="CdigoHTML"/>
+          <w:lang w:val="en-US"/>
+        </w:rPr>
+        <w:t>:#F8FAFC;</w:t>
+      </w:r>
+      <w:r>
+        <w:rPr>
+          <w:lang w:val="en-US"/>
+        </w:rPr>
+        <w:br/>
+      </w:r>
+      <w:r>
+        <w:rPr>
+          <w:rStyle w:val="m"/>
+          <w:rFonts w:eastAsiaTheme="majorEastAsia"/>
+          <w:lang w:val="en-US"/>
+        </w:rPr>
+        <w:t>--surface</w:t>
+      </w:r>
+      <w:r>
+        <w:rPr>
+          <w:rStyle w:val="CdigoHTML"/>
+          <w:lang w:val="en-US"/>
+        </w:rPr>
+        <w:t>:#FFFFFF;</w:t>
+      </w:r>
+      <w:r>
+        <w:rPr>
+          <w:lang w:val="en-US"/>
+        </w:rPr>
+        <w:br/>
+      </w:r>
+      <w:r>
+        <w:rPr>
+          <w:lang w:val="en-US"/>
+        </w:rPr>
+        <w:br/>
+      </w:r>
+      <w:r>
+        <w:rPr>
+          <w:rStyle w:val="m"/>
+          <w:rFonts w:eastAsiaTheme="majorEastAsia"/>
+          <w:lang w:val="en-US"/>
+        </w:rPr>
+        <w:t>--text</w:t>
+      </w:r>
+      <w:r>
+        <w:rPr>
+          <w:rStyle w:val="CdigoHTML"/>
+          <w:lang w:val="en-US"/>
+        </w:rPr>
+        <w:t>:#111827;</w:t>
+      </w:r>
+      <w:r>
+        <w:rPr>
+          <w:lang w:val="en-US"/>
+        </w:rPr>
+        <w:br/>
+      </w:r>
+      <w:r>
+        <w:rPr>
+          <w:rStyle w:val="m"/>
+          <w:rFonts w:eastAsiaTheme="majorEastAsia"/>
+          <w:lang w:val="en-US"/>
+        </w:rPr>
+        <w:t>--text-secondary</w:t>
+      </w:r>
+      <w:r>
+        <w:rPr>
+          <w:rStyle w:val="CdigoHTML"/>
+          <w:lang w:val="en-US"/>
+        </w:rPr>
+        <w:t>:#6B7280;</w:t>
+      </w:r>
+      <w:r>
+        <w:rPr>
+          <w:lang w:val="en-US"/>
+        </w:rPr>
+        <w:br/>
+      </w:r>
+      <w:r>
+        <w:rPr>
+          <w:lang w:val="en-US"/>
+        </w:rPr>
+        <w:br/>
+      </w:r>
+      <w:r>
+        <w:rPr>
+          <w:rStyle w:val="m"/>
+          <w:rFonts w:eastAsiaTheme="majorEastAsia"/>
+          <w:lang w:val="en-US"/>
+        </w:rPr>
+        <w:t>--border</w:t>
+      </w:r>
+      <w:r>
+        <w:rPr>
+          <w:rStyle w:val="CdigoHTML"/>
+          <w:lang w:val="en-US"/>
+        </w:rPr>
+        <w:t>:#E5E7EB;</w:t>
+      </w:r>
+      <w:r>
+        <w:rPr>
+          <w:lang w:val="en-US"/>
+        </w:rPr>
+        <w:br/>
+      </w:r>
+      <w:r>
+        <w:rPr>
+          <w:lang w:val="en-US"/>
+        </w:rPr>
+        <w:br/>
+      </w:r>
+      <w:r>
+        <w:rPr>
+          <w:rStyle w:val="CdigoHTML"/>
+          <w:lang w:val="en-US"/>
+        </w:rPr>
+        <w:t>}</w:t>
+      </w:r>
+    </w:p>
+    <w:p>
+      <w:pPr>
+        <w:pStyle w:val="Ttulo2"/>
+      </w:pPr>
+      <w:r>
+        <w:rPr>
+          <w:rFonts w:ascii="Apple Color Emoji" w:hAnsi="Apple Color Emoji" w:cs="Apple Color Emoji"/>
+        </w:rPr>
+        <w:t>💡</w:t>
+      </w:r>
+      <w:r>
+        <w:t xml:space="preserve"> Recomendación de diseño</w:t>
+      </w:r>
+    </w:p>
+    <w:p>
+      <w:pPr>
+        <w:pStyle w:val="NormalWeb"/>
+      </w:pPr>
+      <w:r>
+        <w:t xml:space="preserve">Como </w:t>
+      </w:r>
+      <w:r>
+        <w:rPr>
+          <w:rStyle w:val="Textoennegrita"/>
+        </w:rPr>
+        <w:t>Mi Tiendita</w:t>
+      </w:r>
+      <w:r>
+        <w:t xml:space="preserve"> será un SaaS moderno, te recomiendo usar un estilo inspirado en </w:t>
+      </w:r>
+      <w:r>
+        <w:rPr>
+          <w:rStyle w:val="Textoennegrita"/>
+        </w:rPr>
+        <w:t>Stripe</w:t>
+      </w:r>
+      <w:r>
+        <w:t xml:space="preserve">, </w:t>
+      </w:r>
+      <w:r>
+        <w:rPr>
+          <w:rStyle w:val="Textoennegrita"/>
+        </w:rPr>
+        <w:t>Linear</w:t>
+      </w:r>
+      <w:r>
+        <w:t xml:space="preserve">, </w:t>
+      </w:r>
+      <w:r>
+        <w:rPr>
+          <w:rStyle w:val="Textoennegrita"/>
+        </w:rPr>
+        <w:t>Notion</w:t>
+      </w:r>
+      <w:r>
+        <w:t xml:space="preserve"> y </w:t>
+      </w:r>
+      <w:r>
+        <w:rPr>
+          <w:rStyle w:val="Textoennegrita"/>
+        </w:rPr>
+        <w:t>Vercel</w:t>
+      </w:r>
+      <w:r>
+        <w:t>:</w:t>
+      </w:r>
+    </w:p>
+    <w:p>
+      <w:pPr>
+        <w:numPr>
+          <w:ilvl w:val="0"/>
+          <w:numId w:val="11"/>
+        </w:numPr>
+        <w:spacing w:before="100" w:beforeAutospacing="1" w:after="100" w:afterAutospacing="1"/>
+      </w:pPr>
+      <w:r>
+        <w:t>Fondo muy claro (</w:t>
+      </w:r>
+      <w:r>
+        <w:rPr>
+          <w:rStyle w:val="CdigoHTML"/>
+          <w:rFonts w:eastAsiaTheme="minorHAnsi"/>
+        </w:rPr>
+        <w:t>#F8FAFC</w:t>
+      </w:r>
+      <w:r>
+        <w:t xml:space="preserve">). </w:t>
+      </w:r>
+    </w:p>
+    <w:p>
+      <w:pPr>
+        <w:numPr>
+          <w:ilvl w:val="0"/>
+          <w:numId w:val="11"/>
+        </w:numPr>
+        <w:spacing w:before="100" w:beforeAutospacing="1" w:after="100" w:afterAutospacing="1"/>
+      </w:pPr>
+      <w:r>
+        <w:t>Sidebar azul marino (</w:t>
+      </w:r>
+      <w:r>
+        <w:rPr>
+          <w:rStyle w:val="CdigoHTML"/>
+          <w:rFonts w:eastAsiaTheme="minorHAnsi"/>
+        </w:rPr>
+        <w:t>#0B2348</w:t>
+      </w:r>
+      <w:r>
+        <w:t xml:space="preserve">). </w:t>
+      </w:r>
+    </w:p>
+    <w:p>
+      <w:pPr>
+        <w:numPr>
+          <w:ilvl w:val="0"/>
+          <w:numId w:val="11"/>
+        </w:numPr>
+        <w:spacing w:before="100" w:beforeAutospacing="1" w:after="100" w:afterAutospacing="1"/>
+      </w:pPr>
+      <w:r>
+        <w:t>Botones y elementos de acción en naranja (</w:t>
+      </w:r>
+      <w:r>
+        <w:rPr>
+          <w:rStyle w:val="CdigoHTML"/>
+          <w:rFonts w:eastAsiaTheme="minorHAnsi"/>
+        </w:rPr>
+        <w:t>#FF7A00</w:t>
+      </w:r>
+      <w:r>
+        <w:t xml:space="preserve">). </w:t>
+      </w:r>
+    </w:p>
+    <w:p>
+      <w:pPr>
+        <w:numPr>
+          <w:ilvl w:val="0"/>
+          <w:numId w:val="11"/>
+        </w:numPr>
+        <w:spacing w:before="100" w:beforeAutospacing="1" w:after="100" w:afterAutospacing="1"/>
+      </w:pPr>
+      <w:r>
+        <w:t xml:space="preserve">Tarjetas blancas con sombras suaves. </w:t>
+      </w:r>
+    </w:p>
+    <w:p>
+      <w:pPr>
+        <w:numPr>
+          <w:ilvl w:val="0"/>
+          <w:numId w:val="11"/>
+        </w:numPr>
+        <w:spacing w:before="100" w:beforeAutospacing="1" w:after="100" w:afterAutospacing="1"/>
+      </w:pPr>
+      <w:r>
+        <w:t xml:space="preserve">Bordes redondeados de </w:t>
+      </w:r>
+      <w:r>
+        <w:rPr>
+          <w:rStyle w:val="Textoennegrita"/>
+        </w:rPr>
+        <w:t>12–16 px</w:t>
+      </w:r>
+      <w:r>
+        <w:t xml:space="preserve">. </w:t>
+      </w:r>
+    </w:p>
+    <w:p>
+      <w:pPr>
+        <w:numPr>
+          <w:ilvl w:val="0"/>
+          <w:numId w:val="11"/>
+        </w:numPr>
+        <w:spacing w:before="100" w:beforeAutospacing="1" w:after="100" w:afterAutospacing="1"/>
+      </w:pPr>
+      <w:r>
+        <w:t xml:space="preserve">Iconografía minimalista (Material Symbols o Lucide Icons). </w:t>
+      </w:r>
+    </w:p>
+    <w:p>
+      <w:pPr>
+        <w:numPr>
+          <w:ilvl w:val="0"/>
+          <w:numId w:val="11"/>
+        </w:numPr>
+        <w:spacing w:before="100" w:beforeAutospacing="1" w:after="100" w:afterAutospacing="1"/>
+      </w:pPr>
+      <w:r>
+        <w:t xml:space="preserve">Tipografía: </w:t>
+      </w:r>
+      <w:r>
+        <w:rPr>
+          <w:rStyle w:val="Textoennegrita"/>
+        </w:rPr>
+        <w:t>Inter</w:t>
+      </w:r>
+      <w:r>
+        <w:t xml:space="preserve">, </w:t>
+      </w:r>
+      <w:r>
+        <w:rPr>
+          <w:rStyle w:val="Textoennegrita"/>
+        </w:rPr>
+        <w:t>Poppins</w:t>
+      </w:r>
+      <w:r>
+        <w:t xml:space="preserve"> o </w:t>
+      </w:r>
+      <w:r>
+        <w:rPr>
+          <w:rStyle w:val="Textoennegrita"/>
+        </w:rPr>
+        <w:t>Manrope</w:t>
+      </w:r>
+      <w:r>
+        <w:t xml:space="preserve">. </w:t>
+      </w:r>
+    </w:p>
+    <w:p>
+      <w:pPr>
+        <w:pStyle w:val="NormalWeb"/>
+      </w:pPr>
+      <w:r>
+        <w:t>Esta combinación mantendrá una identidad visual coherente con el logo y dará una apariencia profesional y moderna al sistema.</w:t>
       </w:r>
     </w:p>
     <w:p>
@@ -3557,6 +6197,155 @@
     </w:lvl>
   </w:abstractNum>
   <w:abstractNum w:abstractNumId="4" w15:restartNumberingAfterBreak="0">
+    <w:nsid w:val="3A6274FF"/>
+    <w:multiLevelType w:val="multilevel"/>
+    <w:tmpl w:val="45901942"/>
+    <w:lvl w:ilvl="0">
+      <w:start w:val="1"/>
+      <w:numFmt w:val="bullet"/>
+      <w:lvlText w:val=""/>
+      <w:lvlJc w:val="left"/>
+      <w:pPr>
+        <w:tabs>
+          <w:tab w:val="num" w:pos="720"/>
+        </w:tabs>
+        <w:ind w:left="720" w:hanging="360"/>
+      </w:pPr>
+      <w:rPr>
+        <w:rFonts w:ascii="Symbol" w:hAnsi="Symbol" w:hint="default"/>
+        <w:sz w:val="20"/>
+      </w:rPr>
+    </w:lvl>
+    <w:lvl w:ilvl="1" w:tentative="1">
+      <w:start w:val="1"/>
+      <w:numFmt w:val="bullet"/>
+      <w:lvlText w:val="o"/>
+      <w:lvlJc w:val="left"/>
+      <w:pPr>
+        <w:tabs>
+          <w:tab w:val="num" w:pos="1440"/>
+        </w:tabs>
+        <w:ind w:left="1440" w:hanging="360"/>
+      </w:pPr>
+      <w:rPr>
+        <w:rFonts w:ascii="Courier New" w:hAnsi="Courier New" w:hint="default"/>
+        <w:sz w:val="20"/>
+      </w:rPr>
+    </w:lvl>
+    <w:lvl w:ilvl="2" w:tentative="1">
+      <w:start w:val="1"/>
+      <w:numFmt w:val="bullet"/>
+      <w:lvlText w:val=""/>
+      <w:lvlJc w:val="left"/>
+      <w:pPr>
+        <w:tabs>
+          <w:tab w:val="num" w:pos="2160"/>
+        </w:tabs>
+        <w:ind w:left="2160" w:hanging="360"/>
+      </w:pPr>
+      <w:rPr>
+        <w:rFonts w:ascii="Wingdings" w:hAnsi="Wingdings" w:hint="default"/>
+        <w:sz w:val="20"/>
+      </w:rPr>
+    </w:lvl>
+    <w:lvl w:ilvl="3" w:tentative="1">
+      <w:start w:val="1"/>
+      <w:numFmt w:val="bullet"/>
+      <w:lvlText w:val=""/>
+      <w:lvlJc w:val="left"/>
+      <w:pPr>
+        <w:tabs>
+          <w:tab w:val="num" w:pos="2880"/>
+        </w:tabs>
+        <w:ind w:left="2880" w:hanging="360"/>
+      </w:pPr>
+      <w:rPr>
+        <w:rFonts w:ascii="Wingdings" w:hAnsi="Wingdings" w:hint="default"/>
+        <w:sz w:val="20"/>
+      </w:rPr>
+    </w:lvl>
+    <w:lvl w:ilvl="4" w:tentative="1">
+      <w:start w:val="1"/>
+      <w:numFmt w:val="bullet"/>
+      <w:lvlText w:val=""/>
+      <w:lvlJc w:val="left"/>
+      <w:pPr>
+        <w:tabs>
+          <w:tab w:val="num" w:pos="3600"/>
+        </w:tabs>
+        <w:ind w:left="3600" w:hanging="360"/>
+      </w:pPr>
+      <w:rPr>
+        <w:rFonts w:ascii="Wingdings" w:hAnsi="Wingdings" w:hint="default"/>
+        <w:sz w:val="20"/>
+      </w:rPr>
+    </w:lvl>
+    <w:lvl w:ilvl="5" w:tentative="1">
+      <w:start w:val="1"/>
+      <w:numFmt w:val="bullet"/>
+      <w:lvlText w:val=""/>
+      <w:lvlJc w:val="left"/>
+      <w:pPr>
+        <w:tabs>
+          <w:tab w:val="num" w:pos="4320"/>
+        </w:tabs>
+        <w:ind w:left="4320" w:hanging="360"/>
+      </w:pPr>
+      <w:rPr>
+        <w:rFonts w:ascii="Wingdings" w:hAnsi="Wingdings" w:hint="default"/>
+        <w:sz w:val="20"/>
+      </w:rPr>
+    </w:lvl>
+    <w:lvl w:ilvl="6" w:tentative="1">
+      <w:start w:val="1"/>
+      <w:numFmt w:val="bullet"/>
+      <w:lvlText w:val=""/>
+      <w:lvlJc w:val="left"/>
+      <w:pPr>
+        <w:tabs>
+          <w:tab w:val="num" w:pos="5040"/>
+        </w:tabs>
+        <w:ind w:left="5040" w:hanging="360"/>
+      </w:pPr>
+      <w:rPr>
+        <w:rFonts w:ascii="Wingdings" w:hAnsi="Wingdings" w:hint="default"/>
+        <w:sz w:val="20"/>
+      </w:rPr>
+    </w:lvl>
+    <w:lvl w:ilvl="7" w:tentative="1">
+      <w:start w:val="1"/>
+      <w:numFmt w:val="bullet"/>
+      <w:lvlText w:val=""/>
+      <w:lvlJc w:val="left"/>
+      <w:pPr>
+        <w:tabs>
+          <w:tab w:val="num" w:pos="5760"/>
+        </w:tabs>
+        <w:ind w:left="5760" w:hanging="360"/>
+      </w:pPr>
+      <w:rPr>
+        <w:rFonts w:ascii="Wingdings" w:hAnsi="Wingdings" w:hint="default"/>
+        <w:sz w:val="20"/>
+      </w:rPr>
+    </w:lvl>
+    <w:lvl w:ilvl="8" w:tentative="1">
+      <w:start w:val="1"/>
+      <w:numFmt w:val="bullet"/>
+      <w:lvlText w:val=""/>
+      <w:lvlJc w:val="left"/>
+      <w:pPr>
+        <w:tabs>
+          <w:tab w:val="num" w:pos="6480"/>
+        </w:tabs>
+        <w:ind w:left="6480" w:hanging="360"/>
+      </w:pPr>
+      <w:rPr>
+        <w:rFonts w:ascii="Wingdings" w:hAnsi="Wingdings" w:hint="default"/>
+        <w:sz w:val="20"/>
+      </w:rPr>
+    </w:lvl>
+  </w:abstractNum>
+  <w:abstractNum w:abstractNumId="5" w15:restartNumberingAfterBreak="0">
     <w:nsid w:val="4B4903E5"/>
     <w:multiLevelType w:val="multilevel"/>
     <w:tmpl w:val="1DF6C12A"/>
@@ -3705,7 +6494,7 @@
       </w:rPr>
     </w:lvl>
   </w:abstractNum>
-  <w:abstractNum w:abstractNumId="5" w15:restartNumberingAfterBreak="0">
+  <w:abstractNum w:abstractNumId="6" w15:restartNumberingAfterBreak="0">
     <w:nsid w:val="67BD7EF1"/>
     <w:multiLevelType w:val="multilevel"/>
     <w:tmpl w:val="8D5A164C"/>
@@ -3854,7 +6643,7 @@
       </w:rPr>
     </w:lvl>
   </w:abstractNum>
-  <w:abstractNum w:abstractNumId="6" w15:restartNumberingAfterBreak="0">
+  <w:abstractNum w:abstractNumId="7" w15:restartNumberingAfterBreak="0">
     <w:nsid w:val="6D202FD5"/>
     <w:multiLevelType w:val="multilevel"/>
     <w:tmpl w:val="572EED7C"/>
@@ -4003,7 +6792,7 @@
       </w:rPr>
     </w:lvl>
   </w:abstractNum>
-  <w:abstractNum w:abstractNumId="7" w15:restartNumberingAfterBreak="0">
+  <w:abstractNum w:abstractNumId="8" w15:restartNumberingAfterBreak="0">
     <w:nsid w:val="763A509C"/>
     <w:multiLevelType w:val="multilevel"/>
     <w:tmpl w:val="4DB477EC"/>
@@ -4152,7 +6941,7 @@
       </w:rPr>
     </w:lvl>
   </w:abstractNum>
-  <w:abstractNum w:abstractNumId="8" w15:restartNumberingAfterBreak="0">
+  <w:abstractNum w:abstractNumId="9" w15:restartNumberingAfterBreak="0">
     <w:nsid w:val="76706A8D"/>
     <w:multiLevelType w:val="multilevel"/>
     <w:tmpl w:val="C166DE86"/>
@@ -4301,7 +7090,7 @@
       </w:rPr>
     </w:lvl>
   </w:abstractNum>
-  <w:abstractNum w:abstractNumId="9" w15:restartNumberingAfterBreak="0">
+  <w:abstractNum w:abstractNumId="10" w15:restartNumberingAfterBreak="0">
     <w:nsid w:val="785054AC"/>
     <w:multiLevelType w:val="multilevel"/>
     <w:tmpl w:val="3FA4D506"/>
@@ -4421,28 +7210,31 @@
     <w:abstractNumId w:val="1"/>
   </w:num>
   <w:num w:numId="3" w16cid:durableId="1777556033">
-    <w:abstractNumId w:val="9"/>
+    <w:abstractNumId w:val="10"/>
   </w:num>
   <w:num w:numId="4" w16cid:durableId="256525739">
-    <w:abstractNumId w:val="4"/>
+    <w:abstractNumId w:val="5"/>
   </w:num>
   <w:num w:numId="5" w16cid:durableId="910582363">
     <w:abstractNumId w:val="0"/>
   </w:num>
   <w:num w:numId="6" w16cid:durableId="95059965">
+    <w:abstractNumId w:val="8"/>
+  </w:num>
+  <w:num w:numId="7" w16cid:durableId="865606900">
     <w:abstractNumId w:val="7"/>
   </w:num>
-  <w:num w:numId="7" w16cid:durableId="865606900">
+  <w:num w:numId="8" w16cid:durableId="1557549007">
     <w:abstractNumId w:val="6"/>
-  </w:num>
-  <w:num w:numId="8" w16cid:durableId="1557549007">
-    <w:abstractNumId w:val="5"/>
   </w:num>
   <w:num w:numId="9" w16cid:durableId="1446778634">
     <w:abstractNumId w:val="2"/>
   </w:num>
   <w:num w:numId="10" w16cid:durableId="788163680">
-    <w:abstractNumId w:val="8"/>
+    <w:abstractNumId w:val="9"/>
+  </w:num>
+  <w:num w:numId="11" w16cid:durableId="1091198639">
+    <w:abstractNumId w:val="4"/>
   </w:num>
 </w:numbering>
 </file>
@@ -4888,6 +7680,27 @@
       <w14:ligatures w14:val="none"/>
     </w:rPr>
   </w:style>
+  <w:style w:type="paragraph" w:styleId="Ttulo3">
+    <w:name w:val="heading 3"/>
+    <w:basedOn w:val="Normal"/>
+    <w:next w:val="Normal"/>
+    <w:link w:val="Ttulo3Car"/>
+    <w:uiPriority w:val="9"/>
+    <w:semiHidden/>
+    <w:unhideWhenUsed/>
+    <w:qFormat/>
+    <w:rsid w:val="00E220C2"/>
+    <w:pPr>
+      <w:keepNext/>
+      <w:keepLines/>
+      <w:spacing w:before="40"/>
+      <w:outlineLvl w:val="2"/>
+    </w:pPr>
+    <w:rPr>
+      <w:rFonts w:asciiTheme="majorHAnsi" w:eastAsiaTheme="majorEastAsia" w:hAnsiTheme="majorHAnsi" w:cstheme="majorBidi"/>
+      <w:color w:val="1F3763" w:themeColor="accent1" w:themeShade="7F"/>
+    </w:rPr>
+  </w:style>
   <w:style w:type="character" w:default="1" w:styleId="Fuentedeprrafopredeter">
     <w:name w:val="Default Paragraph Font"/>
     <w:uiPriority w:val="1"/>
@@ -5076,6 +7889,28 @@
       <w:b/>
       <w:bCs/>
     </w:rPr>
+  </w:style>
+  <w:style w:type="character" w:customStyle="1" w:styleId="Ttulo3Car">
+    <w:name w:val="Título 3 Car"/>
+    <w:basedOn w:val="Fuentedeprrafopredeter"/>
+    <w:link w:val="Ttulo3"/>
+    <w:uiPriority w:val="9"/>
+    <w:semiHidden/>
+    <w:rsid w:val="00E220C2"/>
+    <w:rPr>
+      <w:rFonts w:asciiTheme="majorHAnsi" w:eastAsiaTheme="majorEastAsia" w:hAnsiTheme="majorHAnsi" w:cstheme="majorBidi"/>
+      <w:color w:val="1F3763" w:themeColor="accent1" w:themeShade="7F"/>
+    </w:rPr>
+  </w:style>
+  <w:style w:type="character" w:customStyle="1" w:styleId="l">
+    <w:name w:val="ͼl"/>
+    <w:basedOn w:val="Fuentedeprrafopredeter"/>
+    <w:rsid w:val="00E220C2"/>
+  </w:style>
+  <w:style w:type="character" w:customStyle="1" w:styleId="m">
+    <w:name w:val="ͼm"/>
+    <w:basedOn w:val="Fuentedeprrafopredeter"/>
+    <w:rsid w:val="00E220C2"/>
   </w:style>
 </w:styles>
 </file>

</xml_diff>